<commit_message>
fix template doc and parsing on FE
</commit_message>
<xml_diff>
--- a/template/templateResumeDocV2.docx
+++ b/template/templateResumeDocV2.docx
@@ -23,21 +23,12 @@
           <w15:appearance w15:val="hidden"/>
         </w:sdtPr>
         <w:sdtContent>
-          <w:proofErr w:type="gramStart"/>
           <w:r>
             <w:rPr>
               <w:sz w:val="48"/>
               <w:szCs w:val="48"/>
             </w:rPr>
-            <w:t>{{ candidate.name</w:t>
-          </w:r>
-          <w:proofErr w:type="gramEnd"/>
-          <w:r>
-            <w:rPr>
-              <w:sz w:val="48"/>
-              <w:szCs w:val="48"/>
-            </w:rPr>
-            <w:t xml:space="preserve"> }}</w:t>
+            <w:t>{{ candidate.name }}</w:t>
           </w:r>
         </w:sdtContent>
       </w:sdt>
@@ -61,7 +52,6 @@
           </w:placeholder>
           <w15:appearance w15:val="hidden"/>
         </w:sdtPr>
-        <w:sdtEndPr/>
         <w:sdtContent>
           <w:sdt>
             <w:sdtPr>
@@ -71,89 +61,9 @@
               </w:placeholder>
               <w15:appearance w15:val="hidden"/>
             </w:sdtPr>
-            <w:sdtEndPr/>
             <w:sdtContent>
-              <w:proofErr w:type="gramStart"/>
               <w:r>
-                <w:t xml:space="preserve">{{ </w:t>
-              </w:r>
-              <w:proofErr w:type="spellStart"/>
-              <w:r>
-                <w:t>candidate</w:t>
-              </w:r>
-              <w:proofErr w:type="gramEnd"/>
-              <w:r>
-                <w:t>.</w:t>
-              </w:r>
-              <w:proofErr w:type="gramStart"/>
-              <w:r>
-                <w:t>email</w:t>
-              </w:r>
-              <w:proofErr w:type="spellEnd"/>
-              <w:r>
-                <w:t xml:space="preserve"> }</w:t>
-              </w:r>
-              <w:proofErr w:type="gramEnd"/>
-              <w:r>
-                <w:t xml:space="preserve">} | </w:t>
-              </w:r>
-              <w:proofErr w:type="gramStart"/>
-              <w:r>
-                <w:t xml:space="preserve">{{ </w:t>
-              </w:r>
-              <w:proofErr w:type="spellStart"/>
-              <w:r>
-                <w:t>candidate</w:t>
-              </w:r>
-              <w:proofErr w:type="gramEnd"/>
-              <w:r>
-                <w:t>.</w:t>
-              </w:r>
-              <w:proofErr w:type="gramStart"/>
-              <w:r>
-                <w:t>phone</w:t>
-              </w:r>
-              <w:proofErr w:type="spellEnd"/>
-              <w:r>
-                <w:t xml:space="preserve"> }}{</w:t>
-              </w:r>
-              <w:proofErr w:type="gramEnd"/>
-              <w:r>
-                <w:t xml:space="preserve">% if </w:t>
-              </w:r>
-              <w:proofErr w:type="spellStart"/>
-              <w:proofErr w:type="gramStart"/>
-              <w:r>
-                <w:t>candidate.link</w:t>
-              </w:r>
-              <w:proofErr w:type="spellEnd"/>
-              <w:proofErr w:type="gramEnd"/>
-              <w:r>
-                <w:t xml:space="preserve"> %} | </w:t>
-              </w:r>
-              <w:proofErr w:type="gramStart"/>
-              <w:r>
-                <w:t xml:space="preserve">{{ </w:t>
-              </w:r>
-              <w:proofErr w:type="spellStart"/>
-              <w:r>
-                <w:t>candidate</w:t>
-              </w:r>
-              <w:proofErr w:type="gramEnd"/>
-              <w:r>
-                <w:t>.</w:t>
-              </w:r>
-              <w:proofErr w:type="gramStart"/>
-              <w:r>
-                <w:t>link</w:t>
-              </w:r>
-              <w:proofErr w:type="spellEnd"/>
-              <w:r>
-                <w:t xml:space="preserve"> }}{</w:t>
-              </w:r>
-              <w:proofErr w:type="gramEnd"/>
-              <w:r>
-                <w:t>% endif %}</w:t>
+                <w:t>{{ candidate.email }} | {{ candidate.phone }}{% if candidate.link %} | {{ candidate.link }}{% endif %}</w:t>
               </w:r>
               <w:r>
                 <w:t xml:space="preserve"> </w:t>
@@ -173,26 +83,8 @@
         <w:pStyle w:val="ContactInfo"/>
       </w:pPr>
       <w:r>
-        <w:t xml:space="preserve">{% if </w:t>
-      </w:r>
-      <w:proofErr w:type="spellStart"/>
-      <w:proofErr w:type="gramStart"/>
-      <w:r>
-        <w:t>candidate.professional</w:t>
-      </w:r>
-      <w:proofErr w:type="gramEnd"/>
-      <w:r>
-        <w:t>_</w:t>
-      </w:r>
-      <w:proofErr w:type="gramStart"/>
-      <w:r>
-        <w:t>summary</w:t>
-      </w:r>
-      <w:proofErr w:type="spellEnd"/>
-      <w:r>
-        <w:t xml:space="preserve"> %}</w:t>
-      </w:r>
-      <w:proofErr w:type="gramEnd"/>
+        <w:t>{% if candidate.professional_summary %}</w:t>
+      </w:r>
     </w:p>
     <w:p>
       <w:pPr>
@@ -212,29 +104,8 @@
       <w:pPr>
         <w:pStyle w:val="ContactInfo"/>
       </w:pPr>
-      <w:proofErr w:type="gramStart"/>
-      <w:r>
-        <w:t xml:space="preserve">{{ </w:t>
-      </w:r>
-      <w:proofErr w:type="spellStart"/>
-      <w:r>
-        <w:t>candidate</w:t>
-      </w:r>
-      <w:proofErr w:type="gramEnd"/>
-      <w:r>
-        <w:t>.professional_</w:t>
-      </w:r>
-      <w:proofErr w:type="gramStart"/>
-      <w:r>
-        <w:t>summary</w:t>
-      </w:r>
-      <w:proofErr w:type="spellEnd"/>
-      <w:r>
-        <w:t xml:space="preserve"> }</w:t>
-      </w:r>
-      <w:proofErr w:type="gramEnd"/>
-      <w:r>
-        <w:t>}</w:t>
+      <w:r>
+        <w:t>{{ candidate.professional_summary }}</w:t>
       </w:r>
     </w:p>
     <w:p>
@@ -317,193 +188,39 @@
     </w:p>
     <w:p>
       <w:r>
-        <w:t xml:space="preserve">{% for exp in </w:t>
-      </w:r>
-      <w:proofErr w:type="spellStart"/>
-      <w:proofErr w:type="gramStart"/>
-      <w:r>
-        <w:t>candidate.experience</w:t>
-      </w:r>
-      <w:proofErr w:type="gramEnd"/>
-      <w:r>
-        <w:t>_</w:t>
-      </w:r>
-      <w:proofErr w:type="gramStart"/>
-      <w:r>
-        <w:t>section</w:t>
-      </w:r>
-      <w:proofErr w:type="spellEnd"/>
-      <w:r>
-        <w:t xml:space="preserve"> %}</w:t>
-      </w:r>
-      <w:proofErr w:type="gramEnd"/>
-    </w:p>
-    <w:p>
-      <w:proofErr w:type="gramStart"/>
-      <w:r>
-        <w:t xml:space="preserve">{{ </w:t>
-      </w:r>
-      <w:proofErr w:type="spellStart"/>
-      <w:r>
-        <w:t>exp</w:t>
-      </w:r>
-      <w:proofErr w:type="gramEnd"/>
-      <w:r>
-        <w:t>.</w:t>
-      </w:r>
-      <w:proofErr w:type="gramStart"/>
-      <w:r>
-        <w:t>role</w:t>
-      </w:r>
-      <w:proofErr w:type="spellEnd"/>
-      <w:r>
-        <w:t xml:space="preserve"> }</w:t>
-      </w:r>
-      <w:proofErr w:type="gramEnd"/>
-      <w:r>
-        <w:t xml:space="preserve">} — </w:t>
-      </w:r>
-      <w:proofErr w:type="gramStart"/>
-      <w:r>
-        <w:t xml:space="preserve">{{ </w:t>
-      </w:r>
-      <w:proofErr w:type="spellStart"/>
-      <w:r>
-        <w:t>exp</w:t>
-      </w:r>
-      <w:proofErr w:type="gramEnd"/>
-      <w:r>
-        <w:t>.</w:t>
-      </w:r>
-      <w:proofErr w:type="gramStart"/>
-      <w:r>
-        <w:t>company</w:t>
-      </w:r>
-      <w:proofErr w:type="spellEnd"/>
-      <w:r>
-        <w:t xml:space="preserve"> }}{</w:t>
-      </w:r>
-      <w:proofErr w:type="gramEnd"/>
-      <w:r>
-        <w:t xml:space="preserve">% if </w:t>
-      </w:r>
-      <w:proofErr w:type="spellStart"/>
-      <w:proofErr w:type="gramStart"/>
-      <w:r>
-        <w:t>exp.dates</w:t>
-      </w:r>
-      <w:proofErr w:type="spellEnd"/>
-      <w:proofErr w:type="gramEnd"/>
-      <w:r>
-        <w:t xml:space="preserve"> %} (</w:t>
-      </w:r>
-      <w:proofErr w:type="gramStart"/>
-      <w:r>
-        <w:t xml:space="preserve">{{ </w:t>
-      </w:r>
-      <w:proofErr w:type="spellStart"/>
-      <w:r>
-        <w:t>exp</w:t>
-      </w:r>
-      <w:proofErr w:type="gramEnd"/>
-      <w:r>
-        <w:t>.</w:t>
-      </w:r>
-      <w:proofErr w:type="gramStart"/>
-      <w:r>
-        <w:t>dates</w:t>
-      </w:r>
-      <w:proofErr w:type="spellEnd"/>
-      <w:r>
-        <w:t xml:space="preserve"> }}){</w:t>
-      </w:r>
-      <w:proofErr w:type="gramEnd"/>
-      <w:r>
-        <w:t xml:space="preserve">% </w:t>
-      </w:r>
-      <w:proofErr w:type="gramStart"/>
-      <w:r>
-        <w:t>endif %}</w:t>
-      </w:r>
-      <w:proofErr w:type="gramEnd"/>
-    </w:p>
-    <w:p>
-      <w:r>
-        <w:t xml:space="preserve">{% for bullet in </w:t>
-      </w:r>
-      <w:proofErr w:type="spellStart"/>
-      <w:proofErr w:type="gramStart"/>
-      <w:r>
-        <w:t>exp.bullet</w:t>
-      </w:r>
-      <w:proofErr w:type="gramEnd"/>
-      <w:r>
-        <w:t>_</w:t>
-      </w:r>
-      <w:proofErr w:type="gramStart"/>
-      <w:r>
-        <w:t>points</w:t>
-      </w:r>
-      <w:proofErr w:type="spellEnd"/>
-      <w:r>
-        <w:t xml:space="preserve"> %}</w:t>
-      </w:r>
-      <w:proofErr w:type="gramEnd"/>
-    </w:p>
-    <w:p>
-      <w:r>
-        <w:t xml:space="preserve">• </w:t>
-      </w:r>
-      <w:proofErr w:type="gramStart"/>
-      <w:r>
-        <w:t>{{ bullet</w:t>
-      </w:r>
-      <w:proofErr w:type="gramEnd"/>
-      <w:r>
-        <w:t xml:space="preserve"> }}</w:t>
-      </w:r>
-    </w:p>
-    <w:p>
-      <w:r>
-        <w:t xml:space="preserve">{% </w:t>
-      </w:r>
-      <w:proofErr w:type="spellStart"/>
-      <w:r>
-        <w:t>endfor</w:t>
-      </w:r>
-      <w:proofErr w:type="spellEnd"/>
-      <w:r>
-        <w:t xml:space="preserve"> %}</w:t>
+        <w:t>{% for exp in candidate.experience_section %}</w:t>
+      </w:r>
+    </w:p>
+    <w:p>
+      <w:r>
+        <w:t>{{ exp.role }} — {{ exp.company }}{% if exp.dates %} ({{ exp.dates }}){% endif %}</w:t>
+      </w:r>
+    </w:p>
+    <w:p>
+      <w:r>
+        <w:t>{% for bullet in exp.bullet_points %}</w:t>
+      </w:r>
+    </w:p>
+    <w:p>
+      <w:r>
+        <w:t>• {{ bullet }}</w:t>
+      </w:r>
+    </w:p>
+    <w:p>
+      <w:r>
+        <w:t>{% endfor %}</w:t>
       </w:r>
     </w:p>
     <w:p/>
     <w:p>
       <w:r>
-        <w:t xml:space="preserve">{% </w:t>
-      </w:r>
-      <w:proofErr w:type="spellStart"/>
-      <w:r>
-        <w:t>endfor</w:t>
-      </w:r>
-      <w:proofErr w:type="spellEnd"/>
-      <w:r>
-        <w:t xml:space="preserve"> %}</w:t>
+        <w:t>{% endfor %}</w:t>
       </w:r>
     </w:p>
     <w:p/>
     <w:p>
       <w:r>
-        <w:t xml:space="preserve">{% if </w:t>
-      </w:r>
-      <w:proofErr w:type="spellStart"/>
-      <w:proofErr w:type="gramStart"/>
-      <w:r>
-        <w:t>candidate.projects</w:t>
-      </w:r>
-      <w:proofErr w:type="spellEnd"/>
-      <w:proofErr w:type="gramEnd"/>
-      <w:r>
-        <w:t xml:space="preserve"> %}</w:t>
+        <w:t>{% if candidate.projects %}</w:t>
       </w:r>
     </w:p>
     <w:p>
@@ -513,153 +230,33 @@
     </w:p>
     <w:p>
       <w:r>
-        <w:t xml:space="preserve">{% for </w:t>
-      </w:r>
-      <w:proofErr w:type="spellStart"/>
-      <w:r>
-        <w:t>proj</w:t>
-      </w:r>
-      <w:proofErr w:type="spellEnd"/>
-      <w:r>
-        <w:t xml:space="preserve"> in </w:t>
-      </w:r>
-      <w:proofErr w:type="spellStart"/>
-      <w:proofErr w:type="gramStart"/>
-      <w:r>
-        <w:t>candidate.projects</w:t>
-      </w:r>
-      <w:proofErr w:type="spellEnd"/>
-      <w:proofErr w:type="gramEnd"/>
-      <w:r>
-        <w:t xml:space="preserve"> %}</w:t>
-      </w:r>
-    </w:p>
-    <w:p>
-      <w:proofErr w:type="gramStart"/>
-      <w:r>
-        <w:t xml:space="preserve">{{ </w:t>
-      </w:r>
-      <w:proofErr w:type="spellStart"/>
-      <w:r>
-        <w:t>proj</w:t>
-      </w:r>
-      <w:proofErr w:type="gramEnd"/>
-      <w:r>
-        <w:t>.</w:t>
-      </w:r>
-      <w:proofErr w:type="gramStart"/>
-      <w:r>
-        <w:t>title</w:t>
-      </w:r>
-      <w:proofErr w:type="spellEnd"/>
-      <w:r>
-        <w:t xml:space="preserve"> }}{</w:t>
-      </w:r>
-      <w:proofErr w:type="gramEnd"/>
-      <w:r>
-        <w:t xml:space="preserve">% if </w:t>
-      </w:r>
-      <w:proofErr w:type="spellStart"/>
-      <w:proofErr w:type="gramStart"/>
-      <w:r>
-        <w:t>proj.dates</w:t>
-      </w:r>
-      <w:proofErr w:type="spellEnd"/>
-      <w:proofErr w:type="gramEnd"/>
-      <w:r>
-        <w:t xml:space="preserve"> %} (</w:t>
-      </w:r>
-      <w:proofErr w:type="gramStart"/>
-      <w:r>
-        <w:t xml:space="preserve">{{ </w:t>
-      </w:r>
-      <w:proofErr w:type="spellStart"/>
-      <w:r>
-        <w:t>proj</w:t>
-      </w:r>
-      <w:proofErr w:type="gramEnd"/>
-      <w:r>
-        <w:t>.</w:t>
-      </w:r>
-      <w:proofErr w:type="gramStart"/>
-      <w:r>
-        <w:t>dates</w:t>
-      </w:r>
-      <w:proofErr w:type="spellEnd"/>
-      <w:r>
-        <w:t xml:space="preserve"> }}){</w:t>
-      </w:r>
-      <w:proofErr w:type="gramEnd"/>
-      <w:r>
-        <w:t xml:space="preserve">% </w:t>
-      </w:r>
-      <w:proofErr w:type="gramStart"/>
-      <w:r>
-        <w:t>endif %}</w:t>
-      </w:r>
-      <w:proofErr w:type="gramEnd"/>
-    </w:p>
-    <w:p>
-      <w:r>
-        <w:t xml:space="preserve">{% for bullet in </w:t>
-      </w:r>
-      <w:proofErr w:type="spellStart"/>
-      <w:proofErr w:type="gramStart"/>
-      <w:r>
-        <w:t>proj.bullet</w:t>
-      </w:r>
-      <w:proofErr w:type="gramEnd"/>
-      <w:r>
-        <w:t>_</w:t>
-      </w:r>
-      <w:proofErr w:type="gramStart"/>
-      <w:r>
-        <w:t>points</w:t>
-      </w:r>
-      <w:proofErr w:type="spellEnd"/>
-      <w:r>
-        <w:t xml:space="preserve"> %}</w:t>
-      </w:r>
-      <w:proofErr w:type="gramEnd"/>
-    </w:p>
-    <w:p>
-      <w:r>
-        <w:t xml:space="preserve">• </w:t>
-      </w:r>
-      <w:proofErr w:type="gramStart"/>
-      <w:r>
-        <w:t>{{ bullet</w:t>
-      </w:r>
-      <w:proofErr w:type="gramEnd"/>
-      <w:r>
-        <w:t xml:space="preserve"> }}</w:t>
-      </w:r>
-    </w:p>
-    <w:p>
-      <w:r>
-        <w:t xml:space="preserve">{% </w:t>
-      </w:r>
-      <w:proofErr w:type="spellStart"/>
-      <w:r>
-        <w:t>endfor</w:t>
-      </w:r>
-      <w:proofErr w:type="spellEnd"/>
-      <w:r>
-        <w:t xml:space="preserve"> %}</w:t>
+        <w:t>{% for proj in candidate.projects %}</w:t>
+      </w:r>
+    </w:p>
+    <w:p>
+      <w:r>
+        <w:t>{{ proj.title }}{% if proj.dates %} ({{ proj.dates }}){% endif %}</w:t>
+      </w:r>
+    </w:p>
+    <w:p>
+      <w:r>
+        <w:t>{% for bullet in proj.bullet_points %}</w:t>
+      </w:r>
+    </w:p>
+    <w:p>
+      <w:r>
+        <w:t>• {{ bullet }}</w:t>
+      </w:r>
+    </w:p>
+    <w:p>
+      <w:r>
+        <w:t>{% endfor %}</w:t>
       </w:r>
     </w:p>
     <w:p/>
     <w:p>
       <w:r>
-        <w:t xml:space="preserve">{% </w:t>
-      </w:r>
-      <w:proofErr w:type="spellStart"/>
-      <w:r>
-        <w:t>endfor</w:t>
-      </w:r>
-      <w:proofErr w:type="spellEnd"/>
-      <w:r>
-        <w:t xml:space="preserve"> %}</w:t>
+        <w:t>{% endfor %}</w:t>
       </w:r>
     </w:p>
     <w:p>
@@ -669,17 +266,7 @@
     </w:p>
     <w:p>
       <w:r>
-        <w:t xml:space="preserve">{% if </w:t>
-      </w:r>
-      <w:proofErr w:type="spellStart"/>
-      <w:proofErr w:type="gramStart"/>
-      <w:r>
-        <w:t>candidate.education</w:t>
-      </w:r>
-      <w:proofErr w:type="spellEnd"/>
-      <w:proofErr w:type="gramEnd"/>
-      <w:r>
-        <w:t xml:space="preserve"> %}</w:t>
+        <w:t>{% if candidate.education %}</w:t>
       </w:r>
     </w:p>
     <w:p>
@@ -739,25 +326,7 @@
     </w:p>
     <w:p>
       <w:r>
-        <w:t xml:space="preserve">{% for </w:t>
-      </w:r>
-      <w:proofErr w:type="spellStart"/>
-      <w:r>
-        <w:t>edu</w:t>
-      </w:r>
-      <w:proofErr w:type="spellEnd"/>
-      <w:r>
-        <w:t xml:space="preserve"> in </w:t>
-      </w:r>
-      <w:proofErr w:type="spellStart"/>
-      <w:proofErr w:type="gramStart"/>
-      <w:r>
-        <w:t>candidate.education</w:t>
-      </w:r>
-      <w:proofErr w:type="spellEnd"/>
-      <w:proofErr w:type="gramEnd"/>
-      <w:r>
-        <w:t xml:space="preserve"> %}</w:t>
+        <w:t>{% for edu in candidate.education %}</w:t>
       </w:r>
     </w:p>
     <w:p>
@@ -767,687 +336,182 @@
           <w:bCs/>
         </w:rPr>
       </w:pPr>
-      <w:proofErr w:type="gramStart"/>
       <w:r>
         <w:rPr>
           <w:b w:val="0"/>
           <w:bCs/>
         </w:rPr>
-        <w:t xml:space="preserve">{{ </w:t>
-      </w:r>
-      <w:proofErr w:type="spellStart"/>
-      <w:r>
+        <w:t>{{ edu.degree }} — {{ edu.school }}{% if edu.year %} ({{ edu.year }}){% endif %}</w:t>
+      </w:r>
+    </w:p>
+    <w:p>
+      <w:r>
+        <w:t>{% endfor %}</w:t>
+      </w:r>
+    </w:p>
+    <w:p>
+      <w:r>
+        <w:t>{% endif %}</w:t>
+      </w:r>
+    </w:p>
+    <w:p>
+      <w:r>
+        <w:lastRenderedPageBreak/>
+        <w:t>{% if candidate.certifications %}</w:t>
+      </w:r>
+    </w:p>
+    <w:p>
+      <w:pPr>
+        <w:rPr>
+          <w:sz w:val="22"/>
+          <w:szCs w:val="22"/>
+        </w:rPr>
+      </w:pPr>
+      <w:r>
+        <w:rPr>
+          <w:sz w:val="22"/>
+          <w:szCs w:val="22"/>
+        </w:rPr>
+        <w:t>CERTIFICATIONS</w:t>
+      </w:r>
+    </w:p>
+    <w:p>
+      <w:r>
+        <w:t>{% for cert in candidate.certifications %}</w:t>
+      </w:r>
+    </w:p>
+    <w:p>
+      <w:r>
+        <w:t>• {{ cert }}</w:t>
+      </w:r>
+    </w:p>
+    <w:p>
+      <w:r>
+        <w:t>{% endfor %}</w:t>
+      </w:r>
+    </w:p>
+    <w:p>
+      <w:r>
+        <w:t>{% endif %}</w:t>
+      </w:r>
+    </w:p>
+    <w:p>
+      <w:r>
+        <w:t>{% if candidate.volunteer_experience %}</w:t>
+      </w:r>
+    </w:p>
+    <w:p>
+      <w:pPr>
+        <w:rPr>
+          <w:sz w:val="24"/>
+        </w:rPr>
+      </w:pPr>
+      <w:r>
+        <w:rPr>
+          <w:sz w:val="24"/>
+        </w:rPr>
+        <w:t>VOLUNTEER EXPERIENCE</w:t>
+      </w:r>
+    </w:p>
+    <w:p>
+      <w:pPr>
+        <w:rPr>
+          <w:sz w:val="24"/>
+        </w:rPr>
+      </w:pPr>
+      <w:r>
+        <w:rPr>
+          <w:sz w:val="24"/>
+        </w:rPr>
+        <w:t>----------------------------------------------------------------------------------------------------------------------------------------------------------</w:t>
+      </w:r>
+    </w:p>
+    <w:p>
+      <w:r>
+        <w:t>{% for vol in candidate.volunteer_experience %}</w:t>
+      </w:r>
+    </w:p>
+    <w:p>
+      <w:pPr>
         <w:rPr>
           <w:b w:val="0"/>
           <w:bCs/>
         </w:rPr>
-        <w:t>edu</w:t>
-      </w:r>
-      <w:proofErr w:type="gramEnd"/>
+      </w:pPr>
       <w:r>
         <w:rPr>
           <w:b w:val="0"/>
           <w:bCs/>
         </w:rPr>
-        <w:t>.</w:t>
-      </w:r>
-      <w:proofErr w:type="gramStart"/>
-      <w:r>
+        <w:t>{{ vol.role }} — {{ vol.organization }}{% if vol.dates %} ({{ vol.dates }}){% endif %}</w:t>
+      </w:r>
+    </w:p>
+    <w:p>
+      <w:pPr>
         <w:rPr>
           <w:b w:val="0"/>
           <w:bCs/>
         </w:rPr>
-        <w:t>degree</w:t>
-      </w:r>
-      <w:proofErr w:type="spellEnd"/>
+      </w:pPr>
       <w:r>
         <w:rPr>
           <w:b w:val="0"/>
           <w:bCs/>
         </w:rPr>
-        <w:t xml:space="preserve"> }</w:t>
-      </w:r>
-      <w:proofErr w:type="gramEnd"/>
-      <w:r>
+        <w:t>{% for bullet in vol.bullet_points %}</w:t>
+      </w:r>
+    </w:p>
+    <w:p>
+      <w:pPr>
         <w:rPr>
           <w:b w:val="0"/>
           <w:bCs/>
         </w:rPr>
-        <w:t xml:space="preserve">} — </w:t>
-      </w:r>
-      <w:proofErr w:type="gramStart"/>
+      </w:pPr>
       <w:r>
         <w:rPr>
           <w:b w:val="0"/>
           <w:bCs/>
         </w:rPr>
-        <w:t xml:space="preserve">{{ </w:t>
-      </w:r>
-      <w:proofErr w:type="spellStart"/>
-      <w:r>
+        <w:t>• {{ bullet }}</w:t>
+      </w:r>
+    </w:p>
+    <w:p>
+      <w:pPr>
         <w:rPr>
           <w:b w:val="0"/>
           <w:bCs/>
         </w:rPr>
-        <w:t>edu</w:t>
-      </w:r>
-      <w:proofErr w:type="gramEnd"/>
+      </w:pPr>
       <w:r>
         <w:rPr>
           <w:b w:val="0"/>
           <w:bCs/>
         </w:rPr>
-        <w:t>.</w:t>
-      </w:r>
-      <w:proofErr w:type="gramStart"/>
-      <w:r>
+        <w:t>{% endfor %}</w:t>
+      </w:r>
+    </w:p>
+    <w:p>
+      <w:pPr>
         <w:rPr>
           <w:b w:val="0"/>
           <w:bCs/>
         </w:rPr>
-        <w:t>school</w:t>
-      </w:r>
-      <w:proofErr w:type="spellEnd"/>
-      <w:r>
+      </w:pPr>
+    </w:p>
+    <w:p>
+      <w:pPr>
         <w:rPr>
           <w:b w:val="0"/>
           <w:bCs/>
         </w:rPr>
-        <w:t xml:space="preserve"> }}{</w:t>
-      </w:r>
-      <w:proofErr w:type="gramEnd"/>
+      </w:pPr>
       <w:r>
         <w:rPr>
           <w:b w:val="0"/>
           <w:bCs/>
         </w:rPr>
-        <w:t xml:space="preserve">% if </w:t>
-      </w:r>
-      <w:proofErr w:type="spellStart"/>
-      <w:proofErr w:type="gramStart"/>
-      <w:r>
-        <w:rPr>
-          <w:b w:val="0"/>
-          <w:bCs/>
-        </w:rPr>
-        <w:t>edu.year</w:t>
-      </w:r>
-      <w:proofErr w:type="spellEnd"/>
-      <w:proofErr w:type="gramEnd"/>
-      <w:r>
-        <w:rPr>
-          <w:b w:val="0"/>
-          <w:bCs/>
-        </w:rPr>
-        <w:t xml:space="preserve"> %} (</w:t>
-      </w:r>
-      <w:proofErr w:type="gramStart"/>
-      <w:r>
-        <w:rPr>
-          <w:b w:val="0"/>
-          <w:bCs/>
-        </w:rPr>
-        <w:t xml:space="preserve">{{ </w:t>
-      </w:r>
-      <w:proofErr w:type="spellStart"/>
-      <w:r>
-        <w:rPr>
-          <w:b w:val="0"/>
-          <w:bCs/>
-        </w:rPr>
-        <w:t>edu</w:t>
-      </w:r>
-      <w:proofErr w:type="gramEnd"/>
-      <w:r>
-        <w:rPr>
-          <w:b w:val="0"/>
-          <w:bCs/>
-        </w:rPr>
-        <w:t>.</w:t>
-      </w:r>
-      <w:proofErr w:type="gramStart"/>
-      <w:r>
-        <w:rPr>
-          <w:b w:val="0"/>
-          <w:bCs/>
-        </w:rPr>
-        <w:t>year</w:t>
-      </w:r>
-      <w:proofErr w:type="spellEnd"/>
-      <w:r>
-        <w:rPr>
-          <w:b w:val="0"/>
-          <w:bCs/>
-        </w:rPr>
-        <w:t xml:space="preserve"> }}){</w:t>
-      </w:r>
-      <w:proofErr w:type="gramEnd"/>
-      <w:r>
-        <w:rPr>
-          <w:b w:val="0"/>
-          <w:bCs/>
-        </w:rPr>
-        <w:t xml:space="preserve">% </w:t>
-      </w:r>
-      <w:proofErr w:type="gramStart"/>
-      <w:r>
-        <w:rPr>
-          <w:b w:val="0"/>
-          <w:bCs/>
-        </w:rPr>
-        <w:t>endif %}</w:t>
-      </w:r>
-      <w:proofErr w:type="gramEnd"/>
-    </w:p>
-    <w:p>
-      <w:r>
-        <w:t xml:space="preserve">{% </w:t>
-      </w:r>
-      <w:proofErr w:type="spellStart"/>
-      <w:r>
-        <w:t>endfor</w:t>
-      </w:r>
-      <w:proofErr w:type="spellEnd"/>
-      <w:r>
-        <w:t xml:space="preserve"> %}</w:t>
-      </w:r>
-    </w:p>
-    <w:p>
-      <w:r>
-        <w:t>{% endif %}</w:t>
-      </w:r>
-    </w:p>
-    <w:p>
-      <w:r>
-        <w:lastRenderedPageBreak/>
-        <w:t xml:space="preserve">{% if </w:t>
-      </w:r>
-      <w:proofErr w:type="spellStart"/>
-      <w:proofErr w:type="gramStart"/>
-      <w:r>
-        <w:t>candidate.certifications</w:t>
-      </w:r>
-      <w:proofErr w:type="spellEnd"/>
-      <w:proofErr w:type="gramEnd"/>
-      <w:r>
-        <w:t xml:space="preserve"> %}</w:t>
-      </w:r>
-    </w:p>
-    <w:p>
-      <w:pPr>
-        <w:rPr>
-          <w:sz w:val="22"/>
-          <w:szCs w:val="22"/>
-        </w:rPr>
-      </w:pPr>
-      <w:r>
-        <w:rPr>
-          <w:sz w:val="22"/>
-          <w:szCs w:val="22"/>
-        </w:rPr>
-        <w:t>CERTIFICATIONS</w:t>
-      </w:r>
-    </w:p>
-    <w:p>
-      <w:r>
-        <w:t xml:space="preserve">{% for cert in </w:t>
-      </w:r>
-      <w:proofErr w:type="spellStart"/>
-      <w:proofErr w:type="gramStart"/>
-      <w:r>
-        <w:t>candidate.certifications</w:t>
-      </w:r>
-      <w:proofErr w:type="spellEnd"/>
-      <w:proofErr w:type="gramEnd"/>
-      <w:r>
-        <w:t xml:space="preserve"> %}</w:t>
-      </w:r>
-    </w:p>
-    <w:p>
-      <w:r>
-        <w:t xml:space="preserve">• </w:t>
-      </w:r>
-      <w:proofErr w:type="gramStart"/>
-      <w:r>
-        <w:t>{{ cert</w:t>
-      </w:r>
-      <w:proofErr w:type="gramEnd"/>
-      <w:r>
-        <w:t xml:space="preserve"> }}</w:t>
-      </w:r>
-    </w:p>
-    <w:p>
-      <w:r>
-        <w:t xml:space="preserve">{% </w:t>
-      </w:r>
-      <w:proofErr w:type="spellStart"/>
-      <w:r>
-        <w:t>endfor</w:t>
-      </w:r>
-      <w:proofErr w:type="spellEnd"/>
-      <w:r>
-        <w:t xml:space="preserve"> %}</w:t>
-      </w:r>
-    </w:p>
-    <w:p>
-      <w:r>
-        <w:t>{% endif %}</w:t>
-      </w:r>
-    </w:p>
-    <w:p>
-      <w:r>
-        <w:t xml:space="preserve">{% if </w:t>
-      </w:r>
-      <w:proofErr w:type="spellStart"/>
-      <w:proofErr w:type="gramStart"/>
-      <w:r>
-        <w:t>candidate.projects</w:t>
-      </w:r>
-      <w:proofErr w:type="spellEnd"/>
-      <w:proofErr w:type="gramEnd"/>
-      <w:r>
-        <w:t xml:space="preserve"> %}</w:t>
-      </w:r>
-    </w:p>
-    <w:p>
-      <w:r>
-        <w:t xml:space="preserve">{% if </w:t>
-      </w:r>
-      <w:proofErr w:type="spellStart"/>
-      <w:proofErr w:type="gramStart"/>
-      <w:r>
-        <w:t>candidate.volunteer</w:t>
-      </w:r>
-      <w:proofErr w:type="gramEnd"/>
-      <w:r>
-        <w:t>_</w:t>
-      </w:r>
-      <w:proofErr w:type="gramStart"/>
-      <w:r>
-        <w:t>experience</w:t>
-      </w:r>
-      <w:proofErr w:type="spellEnd"/>
-      <w:r>
-        <w:t xml:space="preserve"> %}</w:t>
-      </w:r>
-      <w:proofErr w:type="gramEnd"/>
-    </w:p>
-    <w:p>
-      <w:pPr>
-        <w:rPr>
-          <w:sz w:val="24"/>
-        </w:rPr>
-      </w:pPr>
-      <w:r>
-        <w:rPr>
-          <w:sz w:val="24"/>
-        </w:rPr>
-        <w:t>VOLUNTEER EXPERIENCE</w:t>
-      </w:r>
-    </w:p>
-    <w:p>
-      <w:pPr>
-        <w:rPr>
-          <w:sz w:val="24"/>
-        </w:rPr>
-      </w:pPr>
-      <w:r>
-        <w:rPr>
-          <w:sz w:val="24"/>
-        </w:rPr>
-        <w:t>----------------------------------------------------------------------------------------------------------------------------------------------------------</w:t>
-      </w:r>
-    </w:p>
-    <w:p>
-      <w:r>
-        <w:t xml:space="preserve">{% for vol in </w:t>
-      </w:r>
-      <w:proofErr w:type="spellStart"/>
-      <w:proofErr w:type="gramStart"/>
-      <w:r>
-        <w:t>candidate.volunteer</w:t>
-      </w:r>
-      <w:proofErr w:type="gramEnd"/>
-      <w:r>
-        <w:t>_</w:t>
-      </w:r>
-      <w:proofErr w:type="gramStart"/>
-      <w:r>
-        <w:t>experience</w:t>
-      </w:r>
-      <w:proofErr w:type="spellEnd"/>
-      <w:r>
-        <w:t xml:space="preserve"> %}</w:t>
-      </w:r>
-      <w:proofErr w:type="gramEnd"/>
-    </w:p>
-    <w:p>
-      <w:pPr>
-        <w:rPr>
-          <w:b w:val="0"/>
-          <w:bCs/>
-        </w:rPr>
-      </w:pPr>
-      <w:proofErr w:type="gramStart"/>
-      <w:r>
-        <w:rPr>
-          <w:b w:val="0"/>
-          <w:bCs/>
-        </w:rPr>
-        <w:t xml:space="preserve">{{ </w:t>
-      </w:r>
-      <w:proofErr w:type="spellStart"/>
-      <w:r>
-        <w:rPr>
-          <w:b w:val="0"/>
-          <w:bCs/>
-        </w:rPr>
-        <w:t>vol</w:t>
-      </w:r>
-      <w:proofErr w:type="gramEnd"/>
-      <w:r>
-        <w:rPr>
-          <w:b w:val="0"/>
-          <w:bCs/>
-        </w:rPr>
-        <w:t>.</w:t>
-      </w:r>
-      <w:proofErr w:type="gramStart"/>
-      <w:r>
-        <w:rPr>
-          <w:b w:val="0"/>
-          <w:bCs/>
-        </w:rPr>
-        <w:t>role</w:t>
-      </w:r>
-      <w:proofErr w:type="spellEnd"/>
-      <w:r>
-        <w:rPr>
-          <w:b w:val="0"/>
-          <w:bCs/>
-        </w:rPr>
-        <w:t xml:space="preserve"> }</w:t>
-      </w:r>
-      <w:proofErr w:type="gramEnd"/>
-      <w:r>
-        <w:rPr>
-          <w:b w:val="0"/>
-          <w:bCs/>
-        </w:rPr>
-        <w:t xml:space="preserve">} — </w:t>
-      </w:r>
-      <w:proofErr w:type="gramStart"/>
-      <w:r>
-        <w:rPr>
-          <w:b w:val="0"/>
-          <w:bCs/>
-        </w:rPr>
-        <w:t xml:space="preserve">{{ </w:t>
-      </w:r>
-      <w:proofErr w:type="spellStart"/>
-      <w:r>
-        <w:rPr>
-          <w:b w:val="0"/>
-          <w:bCs/>
-        </w:rPr>
-        <w:t>vol</w:t>
-      </w:r>
-      <w:proofErr w:type="gramEnd"/>
-      <w:r>
-        <w:rPr>
-          <w:b w:val="0"/>
-          <w:bCs/>
-        </w:rPr>
-        <w:t>.</w:t>
-      </w:r>
-      <w:proofErr w:type="gramStart"/>
-      <w:r>
-        <w:rPr>
-          <w:b w:val="0"/>
-          <w:bCs/>
-        </w:rPr>
-        <w:t>organization</w:t>
-      </w:r>
-      <w:proofErr w:type="spellEnd"/>
-      <w:r>
-        <w:rPr>
-          <w:b w:val="0"/>
-          <w:bCs/>
-        </w:rPr>
-        <w:t xml:space="preserve"> }}{</w:t>
-      </w:r>
-      <w:proofErr w:type="gramEnd"/>
-      <w:r>
-        <w:rPr>
-          <w:b w:val="0"/>
-          <w:bCs/>
-        </w:rPr>
-        <w:t xml:space="preserve">% if </w:t>
-      </w:r>
-      <w:proofErr w:type="spellStart"/>
-      <w:proofErr w:type="gramStart"/>
-      <w:r>
-        <w:rPr>
-          <w:b w:val="0"/>
-          <w:bCs/>
-        </w:rPr>
-        <w:t>vol.dates</w:t>
-      </w:r>
-      <w:proofErr w:type="spellEnd"/>
-      <w:proofErr w:type="gramEnd"/>
-      <w:r>
-        <w:rPr>
-          <w:b w:val="0"/>
-          <w:bCs/>
-        </w:rPr>
-        <w:t xml:space="preserve"> %} (</w:t>
-      </w:r>
-      <w:proofErr w:type="gramStart"/>
-      <w:r>
-        <w:rPr>
-          <w:b w:val="0"/>
-          <w:bCs/>
-        </w:rPr>
-        <w:t xml:space="preserve">{{ </w:t>
-      </w:r>
-      <w:proofErr w:type="spellStart"/>
-      <w:r>
-        <w:rPr>
-          <w:b w:val="0"/>
-          <w:bCs/>
-        </w:rPr>
-        <w:t>vol</w:t>
-      </w:r>
-      <w:proofErr w:type="gramEnd"/>
-      <w:r>
-        <w:rPr>
-          <w:b w:val="0"/>
-          <w:bCs/>
-        </w:rPr>
-        <w:t>.</w:t>
-      </w:r>
-      <w:proofErr w:type="gramStart"/>
-      <w:r>
-        <w:rPr>
-          <w:b w:val="0"/>
-          <w:bCs/>
-        </w:rPr>
-        <w:t>dates</w:t>
-      </w:r>
-      <w:proofErr w:type="spellEnd"/>
-      <w:r>
-        <w:rPr>
-          <w:b w:val="0"/>
-          <w:bCs/>
-        </w:rPr>
-        <w:t xml:space="preserve"> }}){</w:t>
-      </w:r>
-      <w:proofErr w:type="gramEnd"/>
-      <w:r>
-        <w:rPr>
-          <w:b w:val="0"/>
-          <w:bCs/>
-        </w:rPr>
-        <w:t xml:space="preserve">% </w:t>
-      </w:r>
-      <w:proofErr w:type="gramStart"/>
-      <w:r>
-        <w:rPr>
-          <w:b w:val="0"/>
-          <w:bCs/>
-        </w:rPr>
-        <w:t>endif %}</w:t>
-      </w:r>
-      <w:proofErr w:type="gramEnd"/>
-    </w:p>
-    <w:p>
-      <w:pPr>
-        <w:rPr>
-          <w:b w:val="0"/>
-          <w:bCs/>
-        </w:rPr>
-      </w:pPr>
-      <w:r>
-        <w:rPr>
-          <w:b w:val="0"/>
-          <w:bCs/>
-        </w:rPr>
-        <w:t xml:space="preserve">{% for bullet in </w:t>
-      </w:r>
-      <w:proofErr w:type="spellStart"/>
-      <w:proofErr w:type="gramStart"/>
-      <w:r>
-        <w:rPr>
-          <w:b w:val="0"/>
-          <w:bCs/>
-        </w:rPr>
-        <w:t>vol.bullet</w:t>
-      </w:r>
-      <w:proofErr w:type="gramEnd"/>
-      <w:r>
-        <w:rPr>
-          <w:b w:val="0"/>
-          <w:bCs/>
-        </w:rPr>
-        <w:t>_</w:t>
-      </w:r>
-      <w:proofErr w:type="gramStart"/>
-      <w:r>
-        <w:rPr>
-          <w:b w:val="0"/>
-          <w:bCs/>
-        </w:rPr>
-        <w:t>points</w:t>
-      </w:r>
-      <w:proofErr w:type="spellEnd"/>
-      <w:r>
-        <w:rPr>
-          <w:b w:val="0"/>
-          <w:bCs/>
-        </w:rPr>
-        <w:t xml:space="preserve"> %}</w:t>
-      </w:r>
-      <w:proofErr w:type="gramEnd"/>
-    </w:p>
-    <w:p>
-      <w:pPr>
-        <w:rPr>
-          <w:b w:val="0"/>
-          <w:bCs/>
-        </w:rPr>
-      </w:pPr>
-      <w:r>
-        <w:rPr>
-          <w:b w:val="0"/>
-          <w:bCs/>
-        </w:rPr>
-        <w:t xml:space="preserve">• </w:t>
-      </w:r>
-      <w:proofErr w:type="gramStart"/>
-      <w:r>
-        <w:rPr>
-          <w:b w:val="0"/>
-          <w:bCs/>
-        </w:rPr>
-        <w:t>{{ bullet</w:t>
-      </w:r>
-      <w:proofErr w:type="gramEnd"/>
-      <w:r>
-        <w:rPr>
-          <w:b w:val="0"/>
-          <w:bCs/>
-        </w:rPr>
-        <w:t xml:space="preserve"> }}</w:t>
-      </w:r>
-    </w:p>
-    <w:p>
-      <w:pPr>
-        <w:rPr>
-          <w:b w:val="0"/>
-          <w:bCs/>
-        </w:rPr>
-      </w:pPr>
-      <w:r>
-        <w:rPr>
-          <w:b w:val="0"/>
-          <w:bCs/>
-        </w:rPr>
-        <w:t xml:space="preserve">{% </w:t>
-      </w:r>
-      <w:proofErr w:type="spellStart"/>
-      <w:r>
-        <w:rPr>
-          <w:b w:val="0"/>
-          <w:bCs/>
-        </w:rPr>
-        <w:t>endfor</w:t>
-      </w:r>
-      <w:proofErr w:type="spellEnd"/>
-      <w:r>
-        <w:rPr>
-          <w:b w:val="0"/>
-          <w:bCs/>
-        </w:rPr>
-        <w:t xml:space="preserve"> %}</w:t>
-      </w:r>
-    </w:p>
-    <w:p>
-      <w:pPr>
-        <w:rPr>
-          <w:b w:val="0"/>
-          <w:bCs/>
-        </w:rPr>
-      </w:pPr>
-    </w:p>
-    <w:p>
-      <w:pPr>
-        <w:rPr>
-          <w:b w:val="0"/>
-          <w:bCs/>
-        </w:rPr>
-      </w:pPr>
-      <w:r>
-        <w:rPr>
-          <w:b w:val="0"/>
-          <w:bCs/>
-        </w:rPr>
-        <w:t xml:space="preserve">{% </w:t>
-      </w:r>
-      <w:proofErr w:type="spellStart"/>
-      <w:r>
-        <w:rPr>
-          <w:b w:val="0"/>
-          <w:bCs/>
-        </w:rPr>
-        <w:t>endfor</w:t>
-      </w:r>
-      <w:proofErr w:type="spellEnd"/>
-      <w:r>
-        <w:rPr>
-          <w:b w:val="0"/>
-          <w:bCs/>
-        </w:rPr>
-        <w:t xml:space="preserve"> %}</w:t>
+        <w:t>{% endfor %}</w:t>
       </w:r>
     </w:p>
     <w:p>
@@ -1519,97 +583,92 @@
           <w:bCs/>
           <w:color w:val="auto"/>
         </w:rPr>
-        <w:t xml:space="preserve">{% if </w:t>
-      </w:r>
-      <w:proofErr w:type="spellStart"/>
-      <w:proofErr w:type="gramStart"/>
-      <w:r>
+        <w:t>{% if candidate.technical_skills %}</w:t>
+      </w:r>
+    </w:p>
+    <w:p>
+      <w:pPr>
         <w:rPr>
           <w:b w:val="0"/>
           <w:bCs/>
           <w:color w:val="auto"/>
         </w:rPr>
-        <w:t>candidate.technical</w:t>
-      </w:r>
-      <w:proofErr w:type="gramEnd"/>
+      </w:pPr>
       <w:r>
         <w:rPr>
           <w:b w:val="0"/>
           <w:bCs/>
           <w:color w:val="auto"/>
         </w:rPr>
-        <w:t>_skills</w:t>
-      </w:r>
-      <w:proofErr w:type="spellEnd"/>
-      <w:r>
+        <w:t>Technical Skills:</w:t>
+      </w:r>
+    </w:p>
+    <w:p>
+      <w:pPr>
         <w:rPr>
           <w:b w:val="0"/>
           <w:bCs/>
           <w:color w:val="auto"/>
         </w:rPr>
-        <w:t xml:space="preserve"> %}</w:t>
-      </w:r>
-    </w:p>
-    <w:p>
-      <w:pPr>
+      </w:pPr>
+      <w:r>
         <w:rPr>
           <w:b w:val="0"/>
           <w:bCs/>
           <w:color w:val="auto"/>
         </w:rPr>
-      </w:pPr>
-      <w:r>
+        <w:t>{% for skill in candidate.technical_skills %}</w:t>
+      </w:r>
+    </w:p>
+    <w:p>
+      <w:pPr>
         <w:rPr>
           <w:b w:val="0"/>
           <w:bCs/>
           <w:color w:val="auto"/>
         </w:rPr>
-        <w:t>Technical Skills:</w:t>
-      </w:r>
-    </w:p>
-    <w:p>
-      <w:pPr>
+      </w:pPr>
+      <w:r>
         <w:rPr>
           <w:b w:val="0"/>
           <w:bCs/>
           <w:color w:val="auto"/>
         </w:rPr>
-      </w:pPr>
-      <w:r>
+        <w:t>• {{ skill }}</w:t>
+      </w:r>
+    </w:p>
+    <w:p>
+      <w:pPr>
         <w:rPr>
           <w:b w:val="0"/>
           <w:bCs/>
           <w:color w:val="auto"/>
         </w:rPr>
-        <w:t xml:space="preserve">{% for skill in </w:t>
-      </w:r>
-      <w:proofErr w:type="spellStart"/>
-      <w:proofErr w:type="gramStart"/>
+      </w:pPr>
       <w:r>
         <w:rPr>
           <w:b w:val="0"/>
           <w:bCs/>
           <w:color w:val="auto"/>
         </w:rPr>
-        <w:t>candidate.technical</w:t>
-      </w:r>
-      <w:proofErr w:type="gramEnd"/>
-      <w:r>
+        <w:t>{% endfor %}</w:t>
+      </w:r>
+    </w:p>
+    <w:p>
+      <w:pPr>
         <w:rPr>
           <w:b w:val="0"/>
           <w:bCs/>
           <w:color w:val="auto"/>
         </w:rPr>
-        <w:t>_skills</w:t>
-      </w:r>
-      <w:proofErr w:type="spellEnd"/>
+      </w:pPr>
       <w:r>
         <w:rPr>
           <w:b w:val="0"/>
           <w:bCs/>
           <w:color w:val="auto"/>
         </w:rPr>
-        <w:t xml:space="preserve"> %}</w:t>
+        <w:t>{% endif %}</w:t>
       </w:r>
     </w:p>
     <w:p>
@@ -1620,93 +679,91 @@
           <w:color w:val="auto"/>
         </w:rPr>
       </w:pPr>
-      <w:r>
+    </w:p>
+    <w:p>
+      <w:pPr>
         <w:rPr>
           <w:b w:val="0"/>
           <w:bCs/>
           <w:color w:val="auto"/>
         </w:rPr>
-        <w:t xml:space="preserve">• </w:t>
-      </w:r>
-      <w:proofErr w:type="gramStart"/>
+      </w:pPr>
       <w:r>
         <w:rPr>
           <w:b w:val="0"/>
           <w:bCs/>
           <w:color w:val="auto"/>
         </w:rPr>
-        <w:t>{{ skill</w:t>
-      </w:r>
-      <w:proofErr w:type="gramEnd"/>
-      <w:r>
+        <w:t>{% if candidate.soft_skills %}</w:t>
+      </w:r>
+    </w:p>
+    <w:p>
+      <w:pPr>
         <w:rPr>
           <w:b w:val="0"/>
           <w:bCs/>
           <w:color w:val="auto"/>
         </w:rPr>
-        <w:t xml:space="preserve"> }}</w:t>
-      </w:r>
-    </w:p>
-    <w:p>
-      <w:pPr>
+      </w:pPr>
+      <w:r>
         <w:rPr>
           <w:b w:val="0"/>
           <w:bCs/>
           <w:color w:val="auto"/>
         </w:rPr>
-      </w:pPr>
-      <w:r>
+        <w:t>Soft Skills:</w:t>
+      </w:r>
+    </w:p>
+    <w:p>
+      <w:pPr>
         <w:rPr>
           <w:b w:val="0"/>
           <w:bCs/>
           <w:color w:val="auto"/>
         </w:rPr>
-        <w:t xml:space="preserve">{% </w:t>
-      </w:r>
-      <w:proofErr w:type="spellStart"/>
+      </w:pPr>
       <w:r>
         <w:rPr>
           <w:b w:val="0"/>
           <w:bCs/>
           <w:color w:val="auto"/>
         </w:rPr>
-        <w:t>endfor</w:t>
-      </w:r>
-      <w:proofErr w:type="spellEnd"/>
-      <w:r>
+        <w:t>{% for skill in candidate.soft_skills %}</w:t>
+      </w:r>
+    </w:p>
+    <w:p>
+      <w:pPr>
         <w:rPr>
           <w:b w:val="0"/>
           <w:bCs/>
           <w:color w:val="auto"/>
         </w:rPr>
-        <w:t xml:space="preserve"> %}</w:t>
-      </w:r>
-    </w:p>
-    <w:p>
-      <w:pPr>
+      </w:pPr>
+      <w:r>
         <w:rPr>
           <w:b w:val="0"/>
           <w:bCs/>
           <w:color w:val="auto"/>
         </w:rPr>
-      </w:pPr>
-      <w:r>
+        <w:t>• {{ skill }}</w:t>
+      </w:r>
+    </w:p>
+    <w:p>
+      <w:pPr>
         <w:rPr>
           <w:b w:val="0"/>
           <w:bCs/>
           <w:color w:val="auto"/>
         </w:rPr>
-        <w:t>{% endif %}</w:t>
-      </w:r>
-    </w:p>
-    <w:p>
-      <w:pPr>
+      </w:pPr>
+      <w:r>
         <w:rPr>
           <w:b w:val="0"/>
           <w:bCs/>
           <w:color w:val="auto"/>
         </w:rPr>
-      </w:pPr>
+        <w:t>{% endfor %}</w:t>
+      </w:r>
     </w:p>
     <w:p>
       <w:pPr>
@@ -1722,35 +779,33 @@
           <w:bCs/>
           <w:color w:val="auto"/>
         </w:rPr>
-        <w:t xml:space="preserve">{% if </w:t>
-      </w:r>
-      <w:proofErr w:type="spellStart"/>
-      <w:proofErr w:type="gramStart"/>
-      <w:r>
+        <w:t>{% endif %}</w:t>
+      </w:r>
+    </w:p>
+    <w:p>
+      <w:pPr>
         <w:rPr>
           <w:b w:val="0"/>
           <w:bCs/>
           <w:color w:val="auto"/>
         </w:rPr>
-        <w:t>candidate.soft</w:t>
-      </w:r>
-      <w:proofErr w:type="gramEnd"/>
-      <w:r>
+      </w:pPr>
+    </w:p>
+    <w:p>
+      <w:pPr>
         <w:rPr>
           <w:b w:val="0"/>
           <w:bCs/>
           <w:color w:val="auto"/>
         </w:rPr>
-        <w:t>_skills</w:t>
-      </w:r>
-      <w:proofErr w:type="spellEnd"/>
+      </w:pPr>
       <w:r>
         <w:rPr>
           <w:b w:val="0"/>
           <w:bCs/>
           <w:color w:val="auto"/>
         </w:rPr>
-        <w:t xml:space="preserve"> %}</w:t>
+        <w:t>{% if not candidate.technical_skills and not candidate.soft_skills and candidate.skills_flat %}</w:t>
       </w:r>
     </w:p>
     <w:p>
@@ -1767,7 +822,8 @@
           <w:bCs/>
           <w:color w:val="auto"/>
         </w:rPr>
-        <w:t>Soft Skills:</w:t>
+        <w:lastRenderedPageBreak/>
+        <w:t>{% for skill in candidate.skills_flat %}</w:t>
       </w:r>
     </w:p>
     <w:p>
@@ -1784,368 +840,24 @@
           <w:bCs/>
           <w:color w:val="auto"/>
         </w:rPr>
-        <w:t xml:space="preserve">{% for skill in </w:t>
-      </w:r>
-      <w:proofErr w:type="spellStart"/>
-      <w:proofErr w:type="gramStart"/>
-      <w:r>
+        <w:t>• {{ skill }}</w:t>
+      </w:r>
+    </w:p>
+    <w:p>
+      <w:pPr>
         <w:rPr>
           <w:b w:val="0"/>
           <w:bCs/>
           <w:color w:val="auto"/>
         </w:rPr>
-        <w:t>candidate.soft</w:t>
-      </w:r>
-      <w:proofErr w:type="gramEnd"/>
+      </w:pPr>
       <w:r>
         <w:rPr>
           <w:b w:val="0"/>
           <w:bCs/>
           <w:color w:val="auto"/>
         </w:rPr>
-        <w:t>_</w:t>
-      </w:r>
-      <w:proofErr w:type="gramStart"/>
-      <w:r>
-        <w:rPr>
-          <w:b w:val="0"/>
-          <w:bCs/>
-          <w:color w:val="auto"/>
-        </w:rPr>
-        <w:t>skills</w:t>
-      </w:r>
-      <w:proofErr w:type="spellEnd"/>
-      <w:r>
-        <w:rPr>
-          <w:b w:val="0"/>
-          <w:bCs/>
-          <w:color w:val="auto"/>
-        </w:rPr>
-        <w:t xml:space="preserve"> %}</w:t>
-      </w:r>
-      <w:proofErr w:type="gramEnd"/>
-    </w:p>
-    <w:p>
-      <w:pPr>
-        <w:rPr>
-          <w:b w:val="0"/>
-          <w:bCs/>
-          <w:color w:val="auto"/>
-        </w:rPr>
-      </w:pPr>
-      <w:r>
-        <w:rPr>
-          <w:b w:val="0"/>
-          <w:bCs/>
-          <w:color w:val="auto"/>
-        </w:rPr>
-        <w:t xml:space="preserve">• </w:t>
-      </w:r>
-      <w:proofErr w:type="gramStart"/>
-      <w:r>
-        <w:rPr>
-          <w:b w:val="0"/>
-          <w:bCs/>
-          <w:color w:val="auto"/>
-        </w:rPr>
-        <w:t>{{ skill</w:t>
-      </w:r>
-      <w:proofErr w:type="gramEnd"/>
-      <w:r>
-        <w:rPr>
-          <w:b w:val="0"/>
-          <w:bCs/>
-          <w:color w:val="auto"/>
-        </w:rPr>
-        <w:t xml:space="preserve"> }}</w:t>
-      </w:r>
-    </w:p>
-    <w:p>
-      <w:pPr>
-        <w:rPr>
-          <w:b w:val="0"/>
-          <w:bCs/>
-          <w:color w:val="auto"/>
-        </w:rPr>
-      </w:pPr>
-      <w:r>
-        <w:rPr>
-          <w:b w:val="0"/>
-          <w:bCs/>
-          <w:color w:val="auto"/>
-        </w:rPr>
-        <w:t xml:space="preserve">{% </w:t>
-      </w:r>
-      <w:proofErr w:type="spellStart"/>
-      <w:r>
-        <w:rPr>
-          <w:b w:val="0"/>
-          <w:bCs/>
-          <w:color w:val="auto"/>
-        </w:rPr>
-        <w:t>endfor</w:t>
-      </w:r>
-      <w:proofErr w:type="spellEnd"/>
-      <w:r>
-        <w:rPr>
-          <w:b w:val="0"/>
-          <w:bCs/>
-          <w:color w:val="auto"/>
-        </w:rPr>
-        <w:t xml:space="preserve"> %}</w:t>
-      </w:r>
-    </w:p>
-    <w:p>
-      <w:pPr>
-        <w:rPr>
-          <w:b w:val="0"/>
-          <w:bCs/>
-          <w:color w:val="auto"/>
-        </w:rPr>
-      </w:pPr>
-      <w:r>
-        <w:rPr>
-          <w:b w:val="0"/>
-          <w:bCs/>
-          <w:color w:val="auto"/>
-        </w:rPr>
-        <w:t>{% endif %}</w:t>
-      </w:r>
-    </w:p>
-    <w:p>
-      <w:pPr>
-        <w:rPr>
-          <w:b w:val="0"/>
-          <w:bCs/>
-          <w:color w:val="auto"/>
-        </w:rPr>
-      </w:pPr>
-    </w:p>
-    <w:p>
-      <w:pPr>
-        <w:rPr>
-          <w:b w:val="0"/>
-          <w:bCs/>
-          <w:color w:val="auto"/>
-        </w:rPr>
-      </w:pPr>
-      <w:r>
-        <w:rPr>
-          <w:b w:val="0"/>
-          <w:bCs/>
-          <w:color w:val="auto"/>
-        </w:rPr>
-        <w:lastRenderedPageBreak/>
-        <w:t xml:space="preserve">{% if not </w:t>
-      </w:r>
-      <w:proofErr w:type="spellStart"/>
-      <w:proofErr w:type="gramStart"/>
-      <w:r>
-        <w:rPr>
-          <w:b w:val="0"/>
-          <w:bCs/>
-          <w:color w:val="auto"/>
-        </w:rPr>
-        <w:t>candidate.technical</w:t>
-      </w:r>
-      <w:proofErr w:type="gramEnd"/>
-      <w:r>
-        <w:rPr>
-          <w:b w:val="0"/>
-          <w:bCs/>
-          <w:color w:val="auto"/>
-        </w:rPr>
-        <w:t>_skills</w:t>
-      </w:r>
-      <w:proofErr w:type="spellEnd"/>
-      <w:r>
-        <w:rPr>
-          <w:b w:val="0"/>
-          <w:bCs/>
-          <w:color w:val="auto"/>
-        </w:rPr>
-        <w:t xml:space="preserve"> and not </w:t>
-      </w:r>
-      <w:proofErr w:type="spellStart"/>
-      <w:proofErr w:type="gramStart"/>
-      <w:r>
-        <w:rPr>
-          <w:b w:val="0"/>
-          <w:bCs/>
-          <w:color w:val="auto"/>
-        </w:rPr>
-        <w:t>candidate.soft</w:t>
-      </w:r>
-      <w:proofErr w:type="gramEnd"/>
-      <w:r>
-        <w:rPr>
-          <w:b w:val="0"/>
-          <w:bCs/>
-          <w:color w:val="auto"/>
-        </w:rPr>
-        <w:t>_skills</w:t>
-      </w:r>
-      <w:proofErr w:type="spellEnd"/>
-      <w:r>
-        <w:rPr>
-          <w:b w:val="0"/>
-          <w:bCs/>
-          <w:color w:val="auto"/>
-        </w:rPr>
-        <w:t xml:space="preserve"> and </w:t>
-      </w:r>
-      <w:proofErr w:type="spellStart"/>
-      <w:proofErr w:type="gramStart"/>
-      <w:r>
-        <w:rPr>
-          <w:b w:val="0"/>
-          <w:bCs/>
-          <w:color w:val="auto"/>
-        </w:rPr>
-        <w:t>candidate.skills</w:t>
-      </w:r>
-      <w:proofErr w:type="gramEnd"/>
-      <w:r>
-        <w:rPr>
-          <w:b w:val="0"/>
-          <w:bCs/>
-          <w:color w:val="auto"/>
-        </w:rPr>
-        <w:t>_flat</w:t>
-      </w:r>
-      <w:proofErr w:type="spellEnd"/>
-      <w:r>
-        <w:rPr>
-          <w:b w:val="0"/>
-          <w:bCs/>
-          <w:color w:val="auto"/>
-        </w:rPr>
-        <w:t xml:space="preserve"> %}</w:t>
-      </w:r>
-    </w:p>
-    <w:p>
-      <w:pPr>
-        <w:rPr>
-          <w:b w:val="0"/>
-          <w:bCs/>
-          <w:color w:val="auto"/>
-        </w:rPr>
-      </w:pPr>
-      <w:r>
-        <w:rPr>
-          <w:b w:val="0"/>
-          <w:bCs/>
-          <w:color w:val="auto"/>
-        </w:rPr>
-        <w:t xml:space="preserve">{% for skill in </w:t>
-      </w:r>
-      <w:proofErr w:type="spellStart"/>
-      <w:proofErr w:type="gramStart"/>
-      <w:r>
-        <w:rPr>
-          <w:b w:val="0"/>
-          <w:bCs/>
-          <w:color w:val="auto"/>
-        </w:rPr>
-        <w:t>candidate.skills</w:t>
-      </w:r>
-      <w:proofErr w:type="gramEnd"/>
-      <w:r>
-        <w:rPr>
-          <w:b w:val="0"/>
-          <w:bCs/>
-          <w:color w:val="auto"/>
-        </w:rPr>
-        <w:t>_</w:t>
-      </w:r>
-      <w:proofErr w:type="gramStart"/>
-      <w:r>
-        <w:rPr>
-          <w:b w:val="0"/>
-          <w:bCs/>
-          <w:color w:val="auto"/>
-        </w:rPr>
-        <w:t>flat</w:t>
-      </w:r>
-      <w:proofErr w:type="spellEnd"/>
-      <w:r>
-        <w:rPr>
-          <w:b w:val="0"/>
-          <w:bCs/>
-          <w:color w:val="auto"/>
-        </w:rPr>
-        <w:t xml:space="preserve"> %}</w:t>
-      </w:r>
-      <w:proofErr w:type="gramEnd"/>
-    </w:p>
-    <w:p>
-      <w:pPr>
-        <w:rPr>
-          <w:b w:val="0"/>
-          <w:bCs/>
-          <w:color w:val="auto"/>
-        </w:rPr>
-      </w:pPr>
-      <w:r>
-        <w:rPr>
-          <w:b w:val="0"/>
-          <w:bCs/>
-          <w:color w:val="auto"/>
-        </w:rPr>
-        <w:t xml:space="preserve">• </w:t>
-      </w:r>
-      <w:proofErr w:type="gramStart"/>
-      <w:r>
-        <w:rPr>
-          <w:b w:val="0"/>
-          <w:bCs/>
-          <w:color w:val="auto"/>
-        </w:rPr>
-        <w:t>{{ skill</w:t>
-      </w:r>
-      <w:proofErr w:type="gramEnd"/>
-      <w:r>
-        <w:rPr>
-          <w:b w:val="0"/>
-          <w:bCs/>
-          <w:color w:val="auto"/>
-        </w:rPr>
-        <w:t xml:space="preserve"> }}</w:t>
-      </w:r>
-    </w:p>
-    <w:p>
-      <w:pPr>
-        <w:rPr>
-          <w:b w:val="0"/>
-          <w:bCs/>
-          <w:color w:val="auto"/>
-        </w:rPr>
-      </w:pPr>
-      <w:r>
-        <w:rPr>
-          <w:b w:val="0"/>
-          <w:bCs/>
-          <w:color w:val="auto"/>
-        </w:rPr>
-        <w:t xml:space="preserve">{% </w:t>
-      </w:r>
-      <w:proofErr w:type="spellStart"/>
-      <w:r>
-        <w:rPr>
-          <w:b w:val="0"/>
-          <w:bCs/>
-          <w:color w:val="auto"/>
-        </w:rPr>
-        <w:t>endfor</w:t>
-      </w:r>
-      <w:proofErr w:type="spellEnd"/>
-      <w:r>
-        <w:rPr>
-          <w:b w:val="0"/>
-          <w:bCs/>
-          <w:color w:val="auto"/>
-        </w:rPr>
-        <w:t xml:space="preserve"> %}</w:t>
+        <w:t>{% endfor %}</w:t>
       </w:r>
     </w:p>
     <w:p>
@@ -4409,6 +3121,7 @@
   <w:style w:type="character" w:default="1" w:styleId="DefaultParagraphFont">
     <w:name w:val="Default Paragraph Font"/>
     <w:uiPriority w:val="1"/>
+    <w:semiHidden/>
     <w:unhideWhenUsed/>
   </w:style>
   <w:style w:type="table" w:default="1" w:styleId="TableNormal">
@@ -5338,8 +4051,10 @@
   </w:compat>
   <w:rsids>
     <w:rsidRoot w:val="00546C4D"/>
+    <w:rsid w:val="000B571F"/>
     <w:rsid w:val="000C4CF5"/>
     <w:rsid w:val="00132BCB"/>
+    <w:rsid w:val="002C4A40"/>
     <w:rsid w:val="002F7A05"/>
     <w:rsid w:val="00331A91"/>
     <w:rsid w:val="00546C4D"/>
@@ -5802,20 +4517,6 @@
   <w:style w:type="paragraph" w:customStyle="1" w:styleId="12590E65BB9F402EAD76304199E156A8">
     <w:name w:val="12590E65BB9F402EAD76304199E156A8"/>
   </w:style>
-  <w:style w:type="paragraph" w:customStyle="1" w:styleId="B20CA40C23D54E238D2AF04D8C8F2173">
-    <w:name w:val="B20CA40C23D54E238D2AF04D8C8F2173"/>
-    <w:rsid w:val="000C4CF5"/>
-  </w:style>
-  <w:style w:type="paragraph" w:customStyle="1" w:styleId="EE7B446930004C2BB313C3F0E2A18D91">
-    <w:name w:val="EE7B446930004C2BB313C3F0E2A18D91"/>
-  </w:style>
-  <w:style w:type="paragraph" w:customStyle="1" w:styleId="CA686BEC4E4345CA8F1884E26DE05952">
-    <w:name w:val="CA686BEC4E4345CA8F1884E26DE05952"/>
-  </w:style>
-  <w:style w:type="paragraph" w:customStyle="1" w:styleId="AE5ABB7B1C5B45C3BECC5EBF7215DB9E">
-    <w:name w:val="AE5ABB7B1C5B45C3BECC5EBF7215DB9E"/>
-    <w:rsid w:val="000C4CF5"/>
-  </w:style>
   <w:style w:type="paragraph" w:customStyle="1" w:styleId="920057A7F72041B89346FBF3C3077122">
     <w:name w:val="920057A7F72041B89346FBF3C3077122"/>
     <w:rsid w:val="000C4CF5"/>
@@ -5934,23 +4635,8 @@
       <w14:ligatures w14:val="none"/>
     </w:rPr>
   </w:style>
-  <w:style w:type="paragraph" w:customStyle="1" w:styleId="42443D6B1DCB44CCA465F72F521AD2CD">
-    <w:name w:val="42443D6B1DCB44CCA465F72F521AD2CD"/>
-  </w:style>
   <w:style w:type="paragraph" w:customStyle="1" w:styleId="265F5A091BBE46A5AB3B8B89F70415BE">
     <w:name w:val="265F5A091BBE46A5AB3B8B89F70415BE"/>
-    <w:rsid w:val="002F7A05"/>
-  </w:style>
-  <w:style w:type="paragraph" w:customStyle="1" w:styleId="AA912CC64EDC40FA88DA41D1AB2B3F2D">
-    <w:name w:val="AA912CC64EDC40FA88DA41D1AB2B3F2D"/>
-    <w:rsid w:val="002F7A05"/>
-  </w:style>
-  <w:style w:type="paragraph" w:customStyle="1" w:styleId="F837D1D1BD874E14B6FA511A0022720C">
-    <w:name w:val="F837D1D1BD874E14B6FA511A0022720C"/>
-    <w:rsid w:val="002F7A05"/>
-  </w:style>
-  <w:style w:type="paragraph" w:customStyle="1" w:styleId="84B80DF7425448499E57C34166CD15FB">
-    <w:name w:val="84B80DF7425448499E57C34166CD15FB"/>
     <w:rsid w:val="002F7A05"/>
   </w:style>
 </w:styles>
@@ -6165,6 +4851,35 @@
 </file>
 
 <file path=customXml/item1.xml><?xml version="1.0" encoding="utf-8"?>
+<?mso-contentType ?>
+<FormTemplates xmlns="http://schemas.microsoft.com/sharepoint/v3/contenttype/forms">
+  <Display>DocumentLibraryForm</Display>
+  <Edit>DocumentLibraryForm</Edit>
+  <New>DocumentLibraryForm</New>
+</FormTemplates>
+</file>
+
+<file path=customXml/item2.xml><?xml version="1.0" encoding="utf-8"?>
+<p:properties xmlns:p="http://schemas.microsoft.com/office/2006/metadata/properties" xmlns:xsi="http://www.w3.org/2001/XMLSchema-instance" xmlns:pc="http://schemas.microsoft.com/office/infopath/2007/PartnerControls">
+  <documentManagement>
+    <_ip_UnifiedCompliancePolicyUIAction xmlns="http://schemas.microsoft.com/sharepoint/v3" xsi:nil="true"/>
+    <Image xmlns="71af3243-3dd4-4a8d-8c0d-dd76da1f02a5">
+      <Url xsi:nil="true"/>
+      <Description xsi:nil="true"/>
+    </Image>
+    <Status xmlns="71af3243-3dd4-4a8d-8c0d-dd76da1f02a5">Not started</Status>
+    <Background xmlns="71af3243-3dd4-4a8d-8c0d-dd76da1f02a5">false</Background>
+    <_ip_UnifiedCompliancePolicyProperties xmlns="http://schemas.microsoft.com/sharepoint/v3" xsi:nil="true"/>
+    <ImageTagsTaxHTField xmlns="71af3243-3dd4-4a8d-8c0d-dd76da1f02a5">
+      <Terms xmlns="http://schemas.microsoft.com/office/infopath/2007/PartnerControls"/>
+    </ImageTagsTaxHTField>
+    <TaxCatchAll xmlns="230e9df3-be65-4c73-a93b-d1236ebd677e" xsi:nil="true"/>
+    <MediaServiceKeyPoints xmlns="71af3243-3dd4-4a8d-8c0d-dd76da1f02a5" xsi:nil="true"/>
+  </documentManagement>
+</p:properties>
+</file>
+
+<file path=customXml/item3.xml><?xml version="1.0" encoding="utf-8"?>
 <ct:contentTypeSchema xmlns:ct="http://schemas.microsoft.com/office/2006/metadata/contentType" xmlns:ma="http://schemas.microsoft.com/office/2006/metadata/properties/metaAttributes" ct:_="" ma:_="" ma:contentTypeName="Document" ma:contentTypeID="0x01010079F111ED35F8CC479449609E8A0923A6" ma:contentTypeVersion="28" ma:contentTypeDescription="Create a new document." ma:contentTypeScope="" ma:versionID="60f5a4f2d2b0abadcf532d48ebf9cb71">
   <xsd:schema xmlns:xsd="http://www.w3.org/2001/XMLSchema" xmlns:xs="http://www.w3.org/2001/XMLSchema" xmlns:p="http://schemas.microsoft.com/office/2006/metadata/properties" xmlns:ns1="http://schemas.microsoft.com/sharepoint/v3" xmlns:ns2="71af3243-3dd4-4a8d-8c0d-dd76da1f02a5" xmlns:ns3="16c05727-aa75-4e4a-9b5f-8a80a1165891" xmlns:ns4="230e9df3-be65-4c73-a93b-d1236ebd677e" targetNamespace="http://schemas.microsoft.com/office/2006/metadata/properties" ma:root="true" ma:fieldsID="7dd78129e6a1811f84807ad11c651531" ns1:_="" ns2:_="" ns3:_="" ns4:_="">
     <xsd:import namespace="http://schemas.microsoft.com/sharepoint/v3"/>
@@ -6476,36 +5191,27 @@
 </ct:contentTypeSchema>
 </file>
 
-<file path=customXml/item2.xml><?xml version="1.0" encoding="utf-8"?>
-<p:properties xmlns:p="http://schemas.microsoft.com/office/2006/metadata/properties" xmlns:xsi="http://www.w3.org/2001/XMLSchema-instance" xmlns:pc="http://schemas.microsoft.com/office/infopath/2007/PartnerControls">
-  <documentManagement>
-    <_ip_UnifiedCompliancePolicyUIAction xmlns="http://schemas.microsoft.com/sharepoint/v3" xsi:nil="true"/>
-    <Image xmlns="71af3243-3dd4-4a8d-8c0d-dd76da1f02a5">
-      <Url xsi:nil="true"/>
-      <Description xsi:nil="true"/>
-    </Image>
-    <Status xmlns="71af3243-3dd4-4a8d-8c0d-dd76da1f02a5">Not started</Status>
-    <Background xmlns="71af3243-3dd4-4a8d-8c0d-dd76da1f02a5">false</Background>
-    <_ip_UnifiedCompliancePolicyProperties xmlns="http://schemas.microsoft.com/sharepoint/v3" xsi:nil="true"/>
-    <ImageTagsTaxHTField xmlns="71af3243-3dd4-4a8d-8c0d-dd76da1f02a5">
-      <Terms xmlns="http://schemas.microsoft.com/office/infopath/2007/PartnerControls"/>
-    </ImageTagsTaxHTField>
-    <TaxCatchAll xmlns="230e9df3-be65-4c73-a93b-d1236ebd677e" xsi:nil="true"/>
-    <MediaServiceKeyPoints xmlns="71af3243-3dd4-4a8d-8c0d-dd76da1f02a5" xsi:nil="true"/>
-  </documentManagement>
-</p:properties>
+<file path=customXml/itemProps1.xml><?xml version="1.0" encoding="utf-8"?>
+<ds:datastoreItem xmlns:ds="http://schemas.openxmlformats.org/officeDocument/2006/customXml" ds:itemID="{B68BEF44-5CE4-407D-801F-ABCD28C15FEF}">
+  <ds:schemaRefs>
+    <ds:schemaRef ds:uri="http://schemas.microsoft.com/sharepoint/v3/contenttype/forms"/>
+  </ds:schemaRefs>
+</ds:datastoreItem>
 </file>
 
-<file path=customXml/item3.xml><?xml version="1.0" encoding="utf-8"?>
-<?mso-contentType ?>
-<FormTemplates xmlns="http://schemas.microsoft.com/sharepoint/v3/contenttype/forms">
-  <Display>DocumentLibraryForm</Display>
-  <Edit>DocumentLibraryForm</Edit>
-  <New>DocumentLibraryForm</New>
-</FormTemplates>
+<file path=customXml/itemProps2.xml><?xml version="1.0" encoding="utf-8"?>
+<ds:datastoreItem xmlns:ds="http://schemas.openxmlformats.org/officeDocument/2006/customXml" ds:itemID="{9C488EFA-900E-4405-BD4E-E83D13AD8CB6}">
+  <ds:schemaRefs>
+    <ds:schemaRef ds:uri="http://schemas.microsoft.com/office/2006/metadata/properties"/>
+    <ds:schemaRef ds:uri="http://schemas.microsoft.com/office/infopath/2007/PartnerControls"/>
+    <ds:schemaRef ds:uri="http://schemas.microsoft.com/sharepoint/v3"/>
+    <ds:schemaRef ds:uri="71af3243-3dd4-4a8d-8c0d-dd76da1f02a5"/>
+    <ds:schemaRef ds:uri="230e9df3-be65-4c73-a93b-d1236ebd677e"/>
+  </ds:schemaRefs>
+</ds:datastoreItem>
 </file>
 
-<file path=customXml/itemProps1.xml><?xml version="1.0" encoding="utf-8"?>
+<file path=customXml/itemProps3.xml><?xml version="1.0" encoding="utf-8"?>
 <ds:datastoreItem xmlns:ds="http://schemas.openxmlformats.org/officeDocument/2006/customXml" ds:itemID="{F1773DEF-F3EB-4EBC-916F-5D6A2722CF6F}">
   <ds:schemaRefs>
     <ds:schemaRef ds:uri="http://schemas.microsoft.com/office/2006/metadata/contentType"/>
@@ -6526,26 +5232,6 @@
 </ds:datastoreItem>
 </file>
 
-<file path=customXml/itemProps2.xml><?xml version="1.0" encoding="utf-8"?>
-<ds:datastoreItem xmlns:ds="http://schemas.openxmlformats.org/officeDocument/2006/customXml" ds:itemID="{9C488EFA-900E-4405-BD4E-E83D13AD8CB6}">
-  <ds:schemaRefs>
-    <ds:schemaRef ds:uri="http://schemas.microsoft.com/office/2006/metadata/properties"/>
-    <ds:schemaRef ds:uri="http://schemas.microsoft.com/office/infopath/2007/PartnerControls"/>
-    <ds:schemaRef ds:uri="http://schemas.microsoft.com/sharepoint/v3"/>
-    <ds:schemaRef ds:uri="71af3243-3dd4-4a8d-8c0d-dd76da1f02a5"/>
-    <ds:schemaRef ds:uri="230e9df3-be65-4c73-a93b-d1236ebd677e"/>
-  </ds:schemaRefs>
-</ds:datastoreItem>
-</file>
-
-<file path=customXml/itemProps3.xml><?xml version="1.0" encoding="utf-8"?>
-<ds:datastoreItem xmlns:ds="http://schemas.openxmlformats.org/officeDocument/2006/customXml" ds:itemID="{B68BEF44-5CE4-407D-801F-ABCD28C15FEF}">
-  <ds:schemaRefs>
-    <ds:schemaRef ds:uri="http://schemas.microsoft.com/sharepoint/v3/contenttype/forms"/>
-  </ds:schemaRefs>
-</ds:datastoreItem>
-</file>
-
 <file path=docMetadata/LabelInfo.xml><?xml version="1.0" encoding="utf-8"?>
 <clbl:labelList xmlns:clbl="http://schemas.microsoft.com/office/2020/mipLabelMetadata"/>
 </file>
</xml_diff>

<commit_message>
fix docker and template error
</commit_message>
<xml_diff>
--- a/template/templateResumeDocV2.docx
+++ b/template/templateResumeDocV2.docx
@@ -22,23 +22,13 @@
           </w:placeholder>
           <w15:appearance w15:val="hidden"/>
         </w:sdtPr>
-        <w:sdtEndPr/>
         <w:sdtContent>
-          <w:proofErr w:type="gramStart"/>
           <w:r>
             <w:rPr>
               <w:sz w:val="48"/>
               <w:szCs w:val="48"/>
             </w:rPr>
-            <w:t>{{ candidate.name</w:t>
-          </w:r>
-          <w:proofErr w:type="gramEnd"/>
-          <w:r>
-            <w:rPr>
-              <w:sz w:val="48"/>
-              <w:szCs w:val="48"/>
-            </w:rPr>
-            <w:t xml:space="preserve"> }}</w:t>
+            <w:t>{{ candidate.name }}</w:t>
           </w:r>
         </w:sdtContent>
       </w:sdt>
@@ -62,7 +52,6 @@
           </w:placeholder>
           <w15:appearance w15:val="hidden"/>
         </w:sdtPr>
-        <w:sdtEndPr/>
         <w:sdtContent>
           <w:sdt>
             <w:sdtPr>
@@ -72,34 +61,14 @@
               </w:placeholder>
               <w15:appearance w15:val="hidden"/>
             </w:sdtPr>
-            <w:sdtEndPr/>
             <w:sdtContent>
-              <w:proofErr w:type="gramStart"/>
               <w:r>
                 <w:rPr>
                   <w:rFonts w:asciiTheme="minorHAnsi" w:hAnsiTheme="minorHAnsi"/>
                   <w:b/>
                   <w:bCs/>
                 </w:rPr>
-                <w:t>{{ candidate.name</w:t>
-              </w:r>
-              <w:proofErr w:type="gramEnd"/>
-              <w:r>
-                <w:rPr>
-                  <w:rFonts w:asciiTheme="minorHAnsi" w:hAnsiTheme="minorHAnsi"/>
-                  <w:b/>
-                  <w:bCs/>
-                </w:rPr>
-                <w:t xml:space="preserve"> }} • </w:t>
-              </w:r>
-              <w:proofErr w:type="gramStart"/>
-              <w:r>
-                <w:rPr>
-                  <w:rFonts w:asciiTheme="minorHAnsi" w:hAnsiTheme="minorHAnsi"/>
-                  <w:b/>
-                  <w:bCs/>
-                </w:rPr>
-                <w:t xml:space="preserve">{{ </w:t>
+                <w:t xml:space="preserve">{{ candidate.name }} • {{ </w:t>
               </w:r>
               <w:proofErr w:type="spellStart"/>
               <w:r>
@@ -108,25 +77,7 @@
                   <w:b/>
                   <w:bCs/>
                 </w:rPr>
-                <w:t>candidate</w:t>
-              </w:r>
-              <w:proofErr w:type="gramEnd"/>
-              <w:r>
-                <w:rPr>
-                  <w:rFonts w:asciiTheme="minorHAnsi" w:hAnsiTheme="minorHAnsi"/>
-                  <w:b/>
-                  <w:bCs/>
-                </w:rPr>
-                <w:t>.</w:t>
-              </w:r>
-              <w:proofErr w:type="gramStart"/>
-              <w:r>
-                <w:rPr>
-                  <w:rFonts w:asciiTheme="minorHAnsi" w:hAnsiTheme="minorHAnsi"/>
-                  <w:b/>
-                  <w:bCs/>
-                </w:rPr>
-                <w:t>email</w:t>
+                <w:t>candidate.email</w:t>
               </w:r>
               <w:proofErr w:type="spellEnd"/>
               <w:r>
@@ -135,25 +86,7 @@
                   <w:b/>
                   <w:bCs/>
                 </w:rPr>
-                <w:t xml:space="preserve"> }</w:t>
-              </w:r>
-              <w:proofErr w:type="gramEnd"/>
-              <w:r>
-                <w:rPr>
-                  <w:rFonts w:asciiTheme="minorHAnsi" w:hAnsiTheme="minorHAnsi"/>
-                  <w:b/>
-                  <w:bCs/>
-                </w:rPr>
-                <w:t xml:space="preserve">} • </w:t>
-              </w:r>
-              <w:proofErr w:type="gramStart"/>
-              <w:r>
-                <w:rPr>
-                  <w:rFonts w:asciiTheme="minorHAnsi" w:hAnsiTheme="minorHAnsi"/>
-                  <w:b/>
-                  <w:bCs/>
-                </w:rPr>
-                <w:t xml:space="preserve">{{ </w:t>
+                <w:t xml:space="preserve"> }} • {{ </w:t>
               </w:r>
               <w:proofErr w:type="spellStart"/>
               <w:r>
@@ -162,25 +95,7 @@
                   <w:b/>
                   <w:bCs/>
                 </w:rPr>
-                <w:t>candidate</w:t>
-              </w:r>
-              <w:proofErr w:type="gramEnd"/>
-              <w:r>
-                <w:rPr>
-                  <w:rFonts w:asciiTheme="minorHAnsi" w:hAnsiTheme="minorHAnsi"/>
-                  <w:b/>
-                  <w:bCs/>
-                </w:rPr>
-                <w:t>.</w:t>
-              </w:r>
-              <w:proofErr w:type="gramStart"/>
-              <w:r>
-                <w:rPr>
-                  <w:rFonts w:asciiTheme="minorHAnsi" w:hAnsiTheme="minorHAnsi"/>
-                  <w:b/>
-                  <w:bCs/>
-                </w:rPr>
-                <w:t>phone</w:t>
+                <w:t>candidate.phone</w:t>
               </w:r>
               <w:proofErr w:type="spellEnd"/>
               <w:r>
@@ -189,19 +104,9 @@
                   <w:b/>
                   <w:bCs/>
                 </w:rPr>
-                <w:t xml:space="preserve"> }}{</w:t>
-              </w:r>
-              <w:proofErr w:type="gramEnd"/>
-              <w:r>
-                <w:rPr>
-                  <w:rFonts w:asciiTheme="minorHAnsi" w:hAnsiTheme="minorHAnsi"/>
-                  <w:b/>
-                  <w:bCs/>
-                </w:rPr>
-                <w:t xml:space="preserve">% if </w:t>
+                <w:t xml:space="preserve"> }}{% if </w:t>
               </w:r>
               <w:proofErr w:type="spellStart"/>
-              <w:proofErr w:type="gramStart"/>
               <w:r>
                 <w:rPr>
                   <w:rFonts w:asciiTheme="minorHAnsi" w:hAnsiTheme="minorHAnsi"/>
@@ -211,23 +116,13 @@
                 <w:t>candidate.link</w:t>
               </w:r>
               <w:proofErr w:type="spellEnd"/>
-              <w:proofErr w:type="gramEnd"/>
               <w:r>
                 <w:rPr>
                   <w:rFonts w:asciiTheme="minorHAnsi" w:hAnsiTheme="minorHAnsi"/>
                   <w:b/>
                   <w:bCs/>
                 </w:rPr>
-                <w:t xml:space="preserve"> %} • </w:t>
-              </w:r>
-              <w:proofErr w:type="gramStart"/>
-              <w:r>
-                <w:rPr>
-                  <w:rFonts w:asciiTheme="minorHAnsi" w:hAnsiTheme="minorHAnsi"/>
-                  <w:b/>
-                  <w:bCs/>
-                </w:rPr>
-                <w:t xml:space="preserve">{{ </w:t>
+                <w:t xml:space="preserve"> %} • {{ </w:t>
               </w:r>
               <w:proofErr w:type="spellStart"/>
               <w:r>
@@ -236,25 +131,7 @@
                   <w:b/>
                   <w:bCs/>
                 </w:rPr>
-                <w:t>candidate</w:t>
-              </w:r>
-              <w:proofErr w:type="gramEnd"/>
-              <w:r>
-                <w:rPr>
-                  <w:rFonts w:asciiTheme="minorHAnsi" w:hAnsiTheme="minorHAnsi"/>
-                  <w:b/>
-                  <w:bCs/>
-                </w:rPr>
-                <w:t>.</w:t>
-              </w:r>
-              <w:proofErr w:type="gramStart"/>
-              <w:r>
-                <w:rPr>
-                  <w:rFonts w:asciiTheme="minorHAnsi" w:hAnsiTheme="minorHAnsi"/>
-                  <w:b/>
-                  <w:bCs/>
-                </w:rPr>
-                <w:t>link</w:t>
+                <w:t>candidate.link</w:t>
               </w:r>
               <w:proofErr w:type="spellEnd"/>
               <w:r>
@@ -263,16 +140,7 @@
                   <w:b/>
                   <w:bCs/>
                 </w:rPr>
-                <w:t xml:space="preserve"> }}{</w:t>
-              </w:r>
-              <w:proofErr w:type="gramEnd"/>
-              <w:r>
-                <w:rPr>
-                  <w:rFonts w:asciiTheme="minorHAnsi" w:hAnsiTheme="minorHAnsi"/>
-                  <w:b/>
-                  <w:bCs/>
-                </w:rPr>
-                <w:t>% endif %}</w:t>
+                <w:t xml:space="preserve"> }}{% endif %}</w:t>
               </w:r>
             </w:sdtContent>
           </w:sdt>
@@ -287,23 +155,13 @@
         <w:t xml:space="preserve">{% if </w:t>
       </w:r>
       <w:proofErr w:type="spellStart"/>
-      <w:proofErr w:type="gramStart"/>
-      <w:r>
-        <w:t>candidate.professional</w:t>
-      </w:r>
-      <w:proofErr w:type="gramEnd"/>
-      <w:r>
-        <w:t>_</w:t>
-      </w:r>
-      <w:proofErr w:type="gramStart"/>
-      <w:r>
-        <w:t>summary</w:t>
+      <w:r>
+        <w:t>candidate.professional_summary</w:t>
       </w:r>
       <w:proofErr w:type="spellEnd"/>
       <w:r>
         <w:t xml:space="preserve"> %}</w:t>
       </w:r>
-      <w:proofErr w:type="gramEnd"/>
     </w:p>
     <w:p>
       <w:pPr>
@@ -335,29 +193,16 @@
           <w:sz w:val="24"/>
         </w:rPr>
       </w:pPr>
-      <w:proofErr w:type="gramStart"/>
       <w:r>
         <w:t xml:space="preserve">{{ </w:t>
       </w:r>
       <w:proofErr w:type="spellStart"/>
       <w:r>
-        <w:t>candidate</w:t>
-      </w:r>
-      <w:proofErr w:type="gramEnd"/>
-      <w:r>
-        <w:t>.professional_</w:t>
-      </w:r>
-      <w:proofErr w:type="gramStart"/>
-      <w:r>
-        <w:t>summary</w:t>
+        <w:t>candidate.professional_summary</w:t>
       </w:r>
       <w:proofErr w:type="spellEnd"/>
       <w:r>
-        <w:t xml:space="preserve"> }</w:t>
-      </w:r>
-      <w:proofErr w:type="gramEnd"/>
-      <w:r>
-        <w:t>}</w:t>
+        <w:t xml:space="preserve"> }}</w:t>
       </w:r>
     </w:p>
     <w:p>
@@ -412,7 +257,6 @@
                 <w:showingPlcHdr/>
                 <w15:appearance w15:val="hidden"/>
               </w:sdtPr>
-              <w:sdtEndPr/>
               <w:sdtContent>
                 <w:r>
                   <w:rPr>
@@ -458,29 +302,12 @@
         <w:t xml:space="preserve">{% for exp in </w:t>
       </w:r>
       <w:proofErr w:type="spellStart"/>
-      <w:proofErr w:type="gramStart"/>
-      <w:r>
-        <w:rPr>
-          <w:b w:val="0"/>
-          <w:bCs/>
-        </w:rPr>
-        <w:t>candidate.experience</w:t>
-      </w:r>
-      <w:proofErr w:type="gramEnd"/>
-      <w:r>
-        <w:rPr>
-          <w:b w:val="0"/>
-          <w:bCs/>
-        </w:rPr>
-        <w:t>_</w:t>
-      </w:r>
-      <w:proofErr w:type="gramStart"/>
-      <w:r>
-        <w:rPr>
-          <w:b w:val="0"/>
-          <w:bCs/>
-        </w:rPr>
-        <w:t>section</w:t>
+      <w:r>
+        <w:rPr>
+          <w:b w:val="0"/>
+          <w:bCs/>
+        </w:rPr>
+        <w:t>candidate.experience_section</w:t>
       </w:r>
       <w:proofErr w:type="spellEnd"/>
       <w:r>
@@ -490,7 +317,6 @@
         </w:rPr>
         <w:t xml:space="preserve"> %}</w:t>
       </w:r>
-      <w:proofErr w:type="gramEnd"/>
     </w:p>
     <w:p>
       <w:pPr>
@@ -499,7 +325,6 @@
           <w:bCs/>
         </w:rPr>
       </w:pPr>
-      <w:proofErr w:type="gramStart"/>
       <w:r>
         <w:rPr>
           <w:b w:val="0"/>
@@ -513,23 +338,7 @@
           <w:b w:val="0"/>
           <w:bCs/>
         </w:rPr>
-        <w:t>exp</w:t>
-      </w:r>
-      <w:proofErr w:type="gramEnd"/>
-      <w:r>
-        <w:rPr>
-          <w:b w:val="0"/>
-          <w:bCs/>
-        </w:rPr>
-        <w:t>.</w:t>
-      </w:r>
-      <w:proofErr w:type="gramStart"/>
-      <w:r>
-        <w:rPr>
-          <w:b w:val="0"/>
-          <w:bCs/>
-        </w:rPr>
-        <w:t>role</w:t>
+        <w:t>exp.role</w:t>
       </w:r>
       <w:proofErr w:type="spellEnd"/>
       <w:r>
@@ -537,23 +346,7 @@
           <w:b w:val="0"/>
           <w:bCs/>
         </w:rPr>
-        <w:t xml:space="preserve"> }</w:t>
-      </w:r>
-      <w:proofErr w:type="gramEnd"/>
-      <w:r>
-        <w:rPr>
-          <w:b w:val="0"/>
-          <w:bCs/>
-        </w:rPr>
-        <w:t xml:space="preserve">} — </w:t>
-      </w:r>
-      <w:proofErr w:type="gramStart"/>
-      <w:r>
-        <w:rPr>
-          <w:b w:val="0"/>
-          <w:bCs/>
-        </w:rPr>
-        <w:t xml:space="preserve">{{ </w:t>
+        <w:t xml:space="preserve"> }} — {{ </w:t>
       </w:r>
       <w:proofErr w:type="spellStart"/>
       <w:r>
@@ -561,23 +354,7 @@
           <w:b w:val="0"/>
           <w:bCs/>
         </w:rPr>
-        <w:t>exp</w:t>
-      </w:r>
-      <w:proofErr w:type="gramEnd"/>
-      <w:r>
-        <w:rPr>
-          <w:b w:val="0"/>
-          <w:bCs/>
-        </w:rPr>
-        <w:t>.</w:t>
-      </w:r>
-      <w:proofErr w:type="gramStart"/>
-      <w:r>
-        <w:rPr>
-          <w:b w:val="0"/>
-          <w:bCs/>
-        </w:rPr>
-        <w:t>company</w:t>
+        <w:t>exp.company</w:t>
       </w:r>
       <w:proofErr w:type="spellEnd"/>
       <w:r>
@@ -585,18 +362,9 @@
           <w:b w:val="0"/>
           <w:bCs/>
         </w:rPr>
-        <w:t xml:space="preserve"> }}{</w:t>
-      </w:r>
-      <w:proofErr w:type="gramEnd"/>
-      <w:r>
-        <w:rPr>
-          <w:b w:val="0"/>
-          <w:bCs/>
-        </w:rPr>
-        <w:t xml:space="preserve">% if </w:t>
+        <w:t xml:space="preserve"> }}{% if </w:t>
       </w:r>
       <w:proofErr w:type="spellStart"/>
-      <w:proofErr w:type="gramStart"/>
       <w:r>
         <w:rPr>
           <w:b w:val="0"/>
@@ -605,21 +373,12 @@
         <w:t>exp.dates</w:t>
       </w:r>
       <w:proofErr w:type="spellEnd"/>
-      <w:proofErr w:type="gramEnd"/>
-      <w:r>
-        <w:rPr>
-          <w:b w:val="0"/>
-          <w:bCs/>
-        </w:rPr>
-        <w:t xml:space="preserve"> %} (</w:t>
-      </w:r>
-      <w:proofErr w:type="gramStart"/>
-      <w:r>
-        <w:rPr>
-          <w:b w:val="0"/>
-          <w:bCs/>
-        </w:rPr>
-        <w:t xml:space="preserve">{{ </w:t>
+      <w:r>
+        <w:rPr>
+          <w:b w:val="0"/>
+          <w:bCs/>
+        </w:rPr>
+        <w:t xml:space="preserve"> %} ({{ </w:t>
       </w:r>
       <w:proofErr w:type="spellStart"/>
       <w:r>
@@ -627,23 +386,7 @@
           <w:b w:val="0"/>
           <w:bCs/>
         </w:rPr>
-        <w:t>exp</w:t>
-      </w:r>
-      <w:proofErr w:type="gramEnd"/>
-      <w:r>
-        <w:rPr>
-          <w:b w:val="0"/>
-          <w:bCs/>
-        </w:rPr>
-        <w:t>.</w:t>
-      </w:r>
-      <w:proofErr w:type="gramStart"/>
-      <w:r>
-        <w:rPr>
-          <w:b w:val="0"/>
-          <w:bCs/>
-        </w:rPr>
-        <w:t>dates</w:t>
+        <w:t>exp.dates</w:t>
       </w:r>
       <w:proofErr w:type="spellEnd"/>
       <w:r>
@@ -651,25 +394,8 @@
           <w:b w:val="0"/>
           <w:bCs/>
         </w:rPr>
-        <w:t xml:space="preserve"> }}){</w:t>
-      </w:r>
-      <w:proofErr w:type="gramEnd"/>
-      <w:r>
-        <w:rPr>
-          <w:b w:val="0"/>
-          <w:bCs/>
-        </w:rPr>
-        <w:t xml:space="preserve">% </w:t>
-      </w:r>
-      <w:proofErr w:type="gramStart"/>
-      <w:r>
-        <w:rPr>
-          <w:b w:val="0"/>
-          <w:bCs/>
-        </w:rPr>
-        <w:t>endif %}</w:t>
-      </w:r>
-      <w:proofErr w:type="gramEnd"/>
+        <w:t xml:space="preserve"> }}){% endif %}</w:t>
+      </w:r>
     </w:p>
     <w:p>
       <w:pPr>
@@ -686,29 +412,12 @@
         <w:t xml:space="preserve">{% for bullet in </w:t>
       </w:r>
       <w:proofErr w:type="spellStart"/>
-      <w:proofErr w:type="gramStart"/>
-      <w:r>
-        <w:rPr>
-          <w:b w:val="0"/>
-          <w:bCs/>
-        </w:rPr>
-        <w:t>exp.bullet</w:t>
-      </w:r>
-      <w:proofErr w:type="gramEnd"/>
-      <w:r>
-        <w:rPr>
-          <w:b w:val="0"/>
-          <w:bCs/>
-        </w:rPr>
-        <w:t>_</w:t>
-      </w:r>
-      <w:proofErr w:type="gramStart"/>
-      <w:r>
-        <w:rPr>
-          <w:b w:val="0"/>
-          <w:bCs/>
-        </w:rPr>
-        <w:t>points</w:t>
+      <w:r>
+        <w:rPr>
+          <w:b w:val="0"/>
+          <w:bCs/>
+        </w:rPr>
+        <w:t>exp.bullet_points</w:t>
       </w:r>
       <w:proofErr w:type="spellEnd"/>
       <w:r>
@@ -718,7 +427,6 @@
         </w:rPr>
         <w:t xml:space="preserve"> %}</w:t>
       </w:r>
-      <w:proofErr w:type="gramEnd"/>
     </w:p>
     <w:p>
       <w:pPr>
@@ -732,23 +440,7 @@
           <w:b w:val="0"/>
           <w:bCs/>
         </w:rPr>
-        <w:t xml:space="preserve">• </w:t>
-      </w:r>
-      <w:proofErr w:type="gramStart"/>
-      <w:r>
-        <w:rPr>
-          <w:b w:val="0"/>
-          <w:bCs/>
-        </w:rPr>
-        <w:t>{{ bullet</w:t>
-      </w:r>
-      <w:proofErr w:type="gramEnd"/>
-      <w:r>
-        <w:rPr>
-          <w:b w:val="0"/>
-          <w:bCs/>
-        </w:rPr>
-        <w:t xml:space="preserve"> }}</w:t>
+        <w:t>• {{ bullet }}</w:t>
       </w:r>
     </w:p>
     <w:p>
@@ -828,7 +520,6 @@
         <w:t xml:space="preserve">{% if </w:t>
       </w:r>
       <w:proofErr w:type="spellStart"/>
-      <w:proofErr w:type="gramStart"/>
       <w:r>
         <w:rPr>
           <w:b w:val="0"/>
@@ -837,7 +528,6 @@
         <w:t>candidate.projects</w:t>
       </w:r>
       <w:proofErr w:type="spellEnd"/>
-      <w:proofErr w:type="gramEnd"/>
       <w:r>
         <w:rPr>
           <w:b w:val="0"/>
@@ -882,7 +572,6 @@
         <w:t xml:space="preserve"> in </w:t>
       </w:r>
       <w:proofErr w:type="spellStart"/>
-      <w:proofErr w:type="gramStart"/>
       <w:r>
         <w:rPr>
           <w:b w:val="0"/>
@@ -891,7 +580,6 @@
         <w:t>candidate.projects</w:t>
       </w:r>
       <w:proofErr w:type="spellEnd"/>
-      <w:proofErr w:type="gramEnd"/>
       <w:r>
         <w:rPr>
           <w:b w:val="0"/>
@@ -907,7 +595,6 @@
           <w:bCs/>
         </w:rPr>
       </w:pPr>
-      <w:proofErr w:type="gramStart"/>
       <w:r>
         <w:rPr>
           <w:b w:val="0"/>
@@ -921,23 +608,7 @@
           <w:b w:val="0"/>
           <w:bCs/>
         </w:rPr>
-        <w:t>proj</w:t>
-      </w:r>
-      <w:proofErr w:type="gramEnd"/>
-      <w:r>
-        <w:rPr>
-          <w:b w:val="0"/>
-          <w:bCs/>
-        </w:rPr>
-        <w:t>.</w:t>
-      </w:r>
-      <w:proofErr w:type="gramStart"/>
-      <w:r>
-        <w:rPr>
-          <w:b w:val="0"/>
-          <w:bCs/>
-        </w:rPr>
-        <w:t>title</w:t>
+        <w:t>proj.title</w:t>
       </w:r>
       <w:proofErr w:type="spellEnd"/>
       <w:r>
@@ -945,18 +616,9 @@
           <w:b w:val="0"/>
           <w:bCs/>
         </w:rPr>
-        <w:t xml:space="preserve"> }}{</w:t>
-      </w:r>
-      <w:proofErr w:type="gramEnd"/>
-      <w:r>
-        <w:rPr>
-          <w:b w:val="0"/>
-          <w:bCs/>
-        </w:rPr>
-        <w:t xml:space="preserve">% if </w:t>
+        <w:t xml:space="preserve"> }}{% if </w:t>
       </w:r>
       <w:proofErr w:type="spellStart"/>
-      <w:proofErr w:type="gramStart"/>
       <w:r>
         <w:rPr>
           <w:b w:val="0"/>
@@ -965,21 +627,12 @@
         <w:t>proj.dates</w:t>
       </w:r>
       <w:proofErr w:type="spellEnd"/>
-      <w:proofErr w:type="gramEnd"/>
-      <w:r>
-        <w:rPr>
-          <w:b w:val="0"/>
-          <w:bCs/>
-        </w:rPr>
-        <w:t xml:space="preserve"> %} (</w:t>
-      </w:r>
-      <w:proofErr w:type="gramStart"/>
-      <w:r>
-        <w:rPr>
-          <w:b w:val="0"/>
-          <w:bCs/>
-        </w:rPr>
-        <w:t xml:space="preserve">{{ </w:t>
+      <w:r>
+        <w:rPr>
+          <w:b w:val="0"/>
+          <w:bCs/>
+        </w:rPr>
+        <w:t xml:space="preserve"> %} ({{ </w:t>
       </w:r>
       <w:proofErr w:type="spellStart"/>
       <w:r>
@@ -987,23 +640,7 @@
           <w:b w:val="0"/>
           <w:bCs/>
         </w:rPr>
-        <w:t>proj</w:t>
-      </w:r>
-      <w:proofErr w:type="gramEnd"/>
-      <w:r>
-        <w:rPr>
-          <w:b w:val="0"/>
-          <w:bCs/>
-        </w:rPr>
-        <w:t>.</w:t>
-      </w:r>
-      <w:proofErr w:type="gramStart"/>
-      <w:r>
-        <w:rPr>
-          <w:b w:val="0"/>
-          <w:bCs/>
-        </w:rPr>
-        <w:t>dates</w:t>
+        <w:t>proj.dates</w:t>
       </w:r>
       <w:proofErr w:type="spellEnd"/>
       <w:r>
@@ -1011,25 +648,8 @@
           <w:b w:val="0"/>
           <w:bCs/>
         </w:rPr>
-        <w:t xml:space="preserve"> }}){</w:t>
-      </w:r>
-      <w:proofErr w:type="gramEnd"/>
-      <w:r>
-        <w:rPr>
-          <w:b w:val="0"/>
-          <w:bCs/>
-        </w:rPr>
-        <w:t xml:space="preserve">% </w:t>
-      </w:r>
-      <w:proofErr w:type="gramStart"/>
-      <w:r>
-        <w:rPr>
-          <w:b w:val="0"/>
-          <w:bCs/>
-        </w:rPr>
-        <w:t>endif %}</w:t>
-      </w:r>
-      <w:proofErr w:type="gramEnd"/>
+        <w:t xml:space="preserve"> }}){% endif %}</w:t>
+      </w:r>
     </w:p>
     <w:p>
       <w:pPr>
@@ -1046,29 +666,12 @@
         <w:t xml:space="preserve">{% for bullet in </w:t>
       </w:r>
       <w:proofErr w:type="spellStart"/>
-      <w:proofErr w:type="gramStart"/>
-      <w:r>
-        <w:rPr>
-          <w:b w:val="0"/>
-          <w:bCs/>
-        </w:rPr>
-        <w:t>proj.bullet</w:t>
-      </w:r>
-      <w:proofErr w:type="gramEnd"/>
-      <w:r>
-        <w:rPr>
-          <w:b w:val="0"/>
-          <w:bCs/>
-        </w:rPr>
-        <w:t>_</w:t>
-      </w:r>
-      <w:proofErr w:type="gramStart"/>
-      <w:r>
-        <w:rPr>
-          <w:b w:val="0"/>
-          <w:bCs/>
-        </w:rPr>
-        <w:t>points</w:t>
+      <w:r>
+        <w:rPr>
+          <w:b w:val="0"/>
+          <w:bCs/>
+        </w:rPr>
+        <w:t>proj.bullet_points</w:t>
       </w:r>
       <w:proofErr w:type="spellEnd"/>
       <w:r>
@@ -1078,7 +681,6 @@
         </w:rPr>
         <w:t xml:space="preserve"> %}</w:t>
       </w:r>
-      <w:proofErr w:type="gramEnd"/>
     </w:p>
     <w:p>
       <w:pPr>
@@ -1092,23 +694,7 @@
           <w:b w:val="0"/>
           <w:bCs/>
         </w:rPr>
-        <w:t xml:space="preserve">• </w:t>
-      </w:r>
-      <w:proofErr w:type="gramStart"/>
-      <w:r>
-        <w:rPr>
-          <w:b w:val="0"/>
-          <w:bCs/>
-        </w:rPr>
-        <w:t>{{ bullet</w:t>
-      </w:r>
-      <w:proofErr w:type="gramEnd"/>
-      <w:r>
-        <w:rPr>
-          <w:b w:val="0"/>
-          <w:bCs/>
-        </w:rPr>
-        <w:t xml:space="preserve"> }}</w:t>
+        <w:t>• {{ bullet }}</w:t>
       </w:r>
     </w:p>
     <w:p>
@@ -1203,7 +789,6 @@
         <w:t xml:space="preserve">{% if </w:t>
       </w:r>
       <w:proofErr w:type="spellStart"/>
-      <w:proofErr w:type="gramStart"/>
       <w:r>
         <w:rPr>
           <w:b w:val="0"/>
@@ -1212,7 +797,6 @@
         <w:t>candidate.education</w:t>
       </w:r>
       <w:proofErr w:type="spellEnd"/>
-      <w:proofErr w:type="gramEnd"/>
       <w:r>
         <w:rPr>
           <w:b w:val="0"/>
@@ -1243,7 +827,6 @@
           </w:placeholder>
           <w15:appearance w15:val="hidden"/>
         </w:sdtPr>
-        <w:sdtEndPr/>
         <w:sdtContent>
           <w:r>
             <w:rPr>
@@ -1290,12 +873,10 @@
         <w:t xml:space="preserve"> in </w:t>
       </w:r>
       <w:proofErr w:type="spellStart"/>
-      <w:proofErr w:type="gramStart"/>
       <w:r>
         <w:t>candidate.education</w:t>
       </w:r>
       <w:proofErr w:type="spellEnd"/>
-      <w:proofErr w:type="gramEnd"/>
       <w:r>
         <w:t xml:space="preserve"> %}</w:t>
       </w:r>
@@ -1307,7 +888,6 @@
           <w:bCs/>
         </w:rPr>
       </w:pPr>
-      <w:proofErr w:type="gramStart"/>
       <w:r>
         <w:rPr>
           <w:b w:val="0"/>
@@ -1321,23 +901,7 @@
           <w:b w:val="0"/>
           <w:bCs/>
         </w:rPr>
-        <w:t>edu</w:t>
-      </w:r>
-      <w:proofErr w:type="gramEnd"/>
-      <w:r>
-        <w:rPr>
-          <w:b w:val="0"/>
-          <w:bCs/>
-        </w:rPr>
-        <w:t>.</w:t>
-      </w:r>
-      <w:proofErr w:type="gramStart"/>
-      <w:r>
-        <w:rPr>
-          <w:b w:val="0"/>
-          <w:bCs/>
-        </w:rPr>
-        <w:t>degree</w:t>
+        <w:t>edu.degree</w:t>
       </w:r>
       <w:proofErr w:type="spellEnd"/>
       <w:r>
@@ -1345,23 +909,7 @@
           <w:b w:val="0"/>
           <w:bCs/>
         </w:rPr>
-        <w:t xml:space="preserve"> }</w:t>
-      </w:r>
-      <w:proofErr w:type="gramEnd"/>
-      <w:r>
-        <w:rPr>
-          <w:b w:val="0"/>
-          <w:bCs/>
-        </w:rPr>
-        <w:t xml:space="preserve">} — </w:t>
-      </w:r>
-      <w:proofErr w:type="gramStart"/>
-      <w:r>
-        <w:rPr>
-          <w:b w:val="0"/>
-          <w:bCs/>
-        </w:rPr>
-        <w:t xml:space="preserve">{{ </w:t>
+        <w:t xml:space="preserve"> }} — {{ </w:t>
       </w:r>
       <w:proofErr w:type="spellStart"/>
       <w:r>
@@ -1369,23 +917,7 @@
           <w:b w:val="0"/>
           <w:bCs/>
         </w:rPr>
-        <w:t>edu</w:t>
-      </w:r>
-      <w:proofErr w:type="gramEnd"/>
-      <w:r>
-        <w:rPr>
-          <w:b w:val="0"/>
-          <w:bCs/>
-        </w:rPr>
-        <w:t>.</w:t>
-      </w:r>
-      <w:proofErr w:type="gramStart"/>
-      <w:r>
-        <w:rPr>
-          <w:b w:val="0"/>
-          <w:bCs/>
-        </w:rPr>
-        <w:t>school</w:t>
+        <w:t>edu.school</w:t>
       </w:r>
       <w:proofErr w:type="spellEnd"/>
       <w:r>
@@ -1393,18 +925,9 @@
           <w:b w:val="0"/>
           <w:bCs/>
         </w:rPr>
-        <w:t xml:space="preserve"> }}{</w:t>
-      </w:r>
-      <w:proofErr w:type="gramEnd"/>
-      <w:r>
-        <w:rPr>
-          <w:b w:val="0"/>
-          <w:bCs/>
-        </w:rPr>
-        <w:t xml:space="preserve">% if </w:t>
+        <w:t xml:space="preserve"> }}{% if </w:t>
       </w:r>
       <w:proofErr w:type="spellStart"/>
-      <w:proofErr w:type="gramStart"/>
       <w:r>
         <w:rPr>
           <w:b w:val="0"/>
@@ -1413,21 +936,12 @@
         <w:t>edu.year</w:t>
       </w:r>
       <w:proofErr w:type="spellEnd"/>
-      <w:proofErr w:type="gramEnd"/>
-      <w:r>
-        <w:rPr>
-          <w:b w:val="0"/>
-          <w:bCs/>
-        </w:rPr>
-        <w:t xml:space="preserve"> %} (</w:t>
-      </w:r>
-      <w:proofErr w:type="gramStart"/>
-      <w:r>
-        <w:rPr>
-          <w:b w:val="0"/>
-          <w:bCs/>
-        </w:rPr>
-        <w:t xml:space="preserve">{{ </w:t>
+      <w:r>
+        <w:rPr>
+          <w:b w:val="0"/>
+          <w:bCs/>
+        </w:rPr>
+        <w:t xml:space="preserve"> %} ({{ </w:t>
       </w:r>
       <w:proofErr w:type="spellStart"/>
       <w:r>
@@ -1435,23 +949,7 @@
           <w:b w:val="0"/>
           <w:bCs/>
         </w:rPr>
-        <w:t>edu</w:t>
-      </w:r>
-      <w:proofErr w:type="gramEnd"/>
-      <w:r>
-        <w:rPr>
-          <w:b w:val="0"/>
-          <w:bCs/>
-        </w:rPr>
-        <w:t>.</w:t>
-      </w:r>
-      <w:proofErr w:type="gramStart"/>
-      <w:r>
-        <w:rPr>
-          <w:b w:val="0"/>
-          <w:bCs/>
-        </w:rPr>
-        <w:t>year</w:t>
+        <w:t>edu.year</w:t>
       </w:r>
       <w:proofErr w:type="spellEnd"/>
       <w:r>
@@ -1459,25 +957,8 @@
           <w:b w:val="0"/>
           <w:bCs/>
         </w:rPr>
-        <w:t xml:space="preserve"> }}){</w:t>
-      </w:r>
-      <w:proofErr w:type="gramEnd"/>
-      <w:r>
-        <w:rPr>
-          <w:b w:val="0"/>
-          <w:bCs/>
-        </w:rPr>
-        <w:t xml:space="preserve">% </w:t>
-      </w:r>
-      <w:proofErr w:type="gramStart"/>
-      <w:r>
-        <w:rPr>
-          <w:b w:val="0"/>
-          <w:bCs/>
-        </w:rPr>
-        <w:t>endif %}</w:t>
-      </w:r>
-      <w:proofErr w:type="gramEnd"/>
+        <w:t xml:space="preserve"> }}){% endif %}</w:t>
+      </w:r>
     </w:p>
     <w:p>
       <w:r>
@@ -1502,12 +983,10 @@
         <w:t xml:space="preserve">{% if </w:t>
       </w:r>
       <w:proofErr w:type="spellStart"/>
-      <w:proofErr w:type="gramStart"/>
       <w:r>
         <w:t>candidate.certifications</w:t>
       </w:r>
       <w:proofErr w:type="spellEnd"/>
-      <w:proofErr w:type="gramEnd"/>
       <w:r>
         <w:t xml:space="preserve"> %}</w:t>
       </w:r>
@@ -1532,12 +1011,10 @@
         <w:t xml:space="preserve">{% for cert in </w:t>
       </w:r>
       <w:proofErr w:type="spellStart"/>
-      <w:proofErr w:type="gramStart"/>
       <w:r>
         <w:t>candidate.certifications</w:t>
       </w:r>
       <w:proofErr w:type="spellEnd"/>
-      <w:proofErr w:type="gramEnd"/>
       <w:r>
         <w:t xml:space="preserve"> %}</w:t>
       </w:r>
@@ -1545,15 +1022,7 @@
     <w:p>
       <w:r>
         <w:lastRenderedPageBreak/>
-        <w:t xml:space="preserve">• </w:t>
-      </w:r>
-      <w:proofErr w:type="gramStart"/>
-      <w:r>
-        <w:t>{{ cert</w:t>
-      </w:r>
-      <w:proofErr w:type="gramEnd"/>
-      <w:r>
-        <w:t xml:space="preserve"> }}</w:t>
+        <w:t>• {{ cert }}</w:t>
       </w:r>
     </w:p>
     <w:p>
@@ -1579,23 +1048,13 @@
         <w:t xml:space="preserve">{% if </w:t>
       </w:r>
       <w:proofErr w:type="spellStart"/>
-      <w:proofErr w:type="gramStart"/>
-      <w:r>
-        <w:t>candidate.volunteer</w:t>
-      </w:r>
-      <w:proofErr w:type="gramEnd"/>
-      <w:r>
-        <w:t>_</w:t>
-      </w:r>
-      <w:proofErr w:type="gramStart"/>
-      <w:r>
-        <w:t>experience</w:t>
+      <w:r>
+        <w:t>candidate.volunteer_experience</w:t>
       </w:r>
       <w:proofErr w:type="spellEnd"/>
       <w:r>
         <w:t xml:space="preserve"> %}</w:t>
       </w:r>
-      <w:proofErr w:type="gramEnd"/>
     </w:p>
     <w:p>
       <w:pPr>
@@ -1628,23 +1087,13 @@
         <w:t xml:space="preserve">{% for vol in </w:t>
       </w:r>
       <w:proofErr w:type="spellStart"/>
-      <w:proofErr w:type="gramStart"/>
-      <w:r>
-        <w:t>candidate.volunteer</w:t>
-      </w:r>
-      <w:proofErr w:type="gramEnd"/>
-      <w:r>
-        <w:t>_</w:t>
-      </w:r>
-      <w:proofErr w:type="gramStart"/>
-      <w:r>
-        <w:t>experience</w:t>
+      <w:r>
+        <w:t>candidate.volunteer_experience</w:t>
       </w:r>
       <w:proofErr w:type="spellEnd"/>
       <w:r>
         <w:t xml:space="preserve"> %}</w:t>
       </w:r>
-      <w:proofErr w:type="gramEnd"/>
     </w:p>
     <w:p>
       <w:pPr>
@@ -1653,7 +1102,6 @@
           <w:bCs/>
         </w:rPr>
       </w:pPr>
-      <w:proofErr w:type="gramStart"/>
       <w:r>
         <w:rPr>
           <w:b w:val="0"/>
@@ -1667,23 +1115,7 @@
           <w:b w:val="0"/>
           <w:bCs/>
         </w:rPr>
-        <w:t>vol</w:t>
-      </w:r>
-      <w:proofErr w:type="gramEnd"/>
-      <w:r>
-        <w:rPr>
-          <w:b w:val="0"/>
-          <w:bCs/>
-        </w:rPr>
-        <w:t>.</w:t>
-      </w:r>
-      <w:proofErr w:type="gramStart"/>
-      <w:r>
-        <w:rPr>
-          <w:b w:val="0"/>
-          <w:bCs/>
-        </w:rPr>
-        <w:t>role</w:t>
+        <w:t>vol.role</w:t>
       </w:r>
       <w:proofErr w:type="spellEnd"/>
       <w:r>
@@ -1691,23 +1123,7 @@
           <w:b w:val="0"/>
           <w:bCs/>
         </w:rPr>
-        <w:t xml:space="preserve"> }</w:t>
-      </w:r>
-      <w:proofErr w:type="gramEnd"/>
-      <w:r>
-        <w:rPr>
-          <w:b w:val="0"/>
-          <w:bCs/>
-        </w:rPr>
-        <w:t xml:space="preserve">} — </w:t>
-      </w:r>
-      <w:proofErr w:type="gramStart"/>
-      <w:r>
-        <w:rPr>
-          <w:b w:val="0"/>
-          <w:bCs/>
-        </w:rPr>
-        <w:t xml:space="preserve">{{ </w:t>
+        <w:t xml:space="preserve"> }} — {{ </w:t>
       </w:r>
       <w:proofErr w:type="spellStart"/>
       <w:r>
@@ -1715,23 +1131,7 @@
           <w:b w:val="0"/>
           <w:bCs/>
         </w:rPr>
-        <w:t>vol</w:t>
-      </w:r>
-      <w:proofErr w:type="gramEnd"/>
-      <w:r>
-        <w:rPr>
-          <w:b w:val="0"/>
-          <w:bCs/>
-        </w:rPr>
-        <w:t>.</w:t>
-      </w:r>
-      <w:proofErr w:type="gramStart"/>
-      <w:r>
-        <w:rPr>
-          <w:b w:val="0"/>
-          <w:bCs/>
-        </w:rPr>
-        <w:t>organization</w:t>
+        <w:t>vol.organization</w:t>
       </w:r>
       <w:proofErr w:type="spellEnd"/>
       <w:r>
@@ -1739,18 +1139,9 @@
           <w:b w:val="0"/>
           <w:bCs/>
         </w:rPr>
-        <w:t xml:space="preserve"> }}{</w:t>
-      </w:r>
-      <w:proofErr w:type="gramEnd"/>
-      <w:r>
-        <w:rPr>
-          <w:b w:val="0"/>
-          <w:bCs/>
-        </w:rPr>
-        <w:t xml:space="preserve">% if </w:t>
+        <w:t xml:space="preserve"> }}{% if </w:t>
       </w:r>
       <w:proofErr w:type="spellStart"/>
-      <w:proofErr w:type="gramStart"/>
       <w:r>
         <w:rPr>
           <w:b w:val="0"/>
@@ -1759,21 +1150,12 @@
         <w:t>vol.dates</w:t>
       </w:r>
       <w:proofErr w:type="spellEnd"/>
-      <w:proofErr w:type="gramEnd"/>
-      <w:r>
-        <w:rPr>
-          <w:b w:val="0"/>
-          <w:bCs/>
-        </w:rPr>
-        <w:t xml:space="preserve"> %} (</w:t>
-      </w:r>
-      <w:proofErr w:type="gramStart"/>
-      <w:r>
-        <w:rPr>
-          <w:b w:val="0"/>
-          <w:bCs/>
-        </w:rPr>
-        <w:t xml:space="preserve">{{ </w:t>
+      <w:r>
+        <w:rPr>
+          <w:b w:val="0"/>
+          <w:bCs/>
+        </w:rPr>
+        <w:t xml:space="preserve"> %} ({{ </w:t>
       </w:r>
       <w:proofErr w:type="spellStart"/>
       <w:r>
@@ -1781,23 +1163,7 @@
           <w:b w:val="0"/>
           <w:bCs/>
         </w:rPr>
-        <w:t>vol</w:t>
-      </w:r>
-      <w:proofErr w:type="gramEnd"/>
-      <w:r>
-        <w:rPr>
-          <w:b w:val="0"/>
-          <w:bCs/>
-        </w:rPr>
-        <w:t>.</w:t>
-      </w:r>
-      <w:proofErr w:type="gramStart"/>
-      <w:r>
-        <w:rPr>
-          <w:b w:val="0"/>
-          <w:bCs/>
-        </w:rPr>
-        <w:t>dates</w:t>
+        <w:t>vol.dates</w:t>
       </w:r>
       <w:proofErr w:type="spellEnd"/>
       <w:r>
@@ -1805,25 +1171,8 @@
           <w:b w:val="0"/>
           <w:bCs/>
         </w:rPr>
-        <w:t xml:space="preserve"> }}){</w:t>
-      </w:r>
-      <w:proofErr w:type="gramEnd"/>
-      <w:r>
-        <w:rPr>
-          <w:b w:val="0"/>
-          <w:bCs/>
-        </w:rPr>
-        <w:t xml:space="preserve">% </w:t>
-      </w:r>
-      <w:proofErr w:type="gramStart"/>
-      <w:r>
-        <w:rPr>
-          <w:b w:val="0"/>
-          <w:bCs/>
-        </w:rPr>
-        <w:t>endif %}</w:t>
-      </w:r>
-      <w:proofErr w:type="gramEnd"/>
+        <w:t xml:space="preserve"> }}){% endif %}</w:t>
+      </w:r>
     </w:p>
     <w:p>
       <w:pPr>
@@ -1840,29 +1189,12 @@
         <w:t xml:space="preserve">{% for bullet in </w:t>
       </w:r>
       <w:proofErr w:type="spellStart"/>
-      <w:proofErr w:type="gramStart"/>
-      <w:r>
-        <w:rPr>
-          <w:b w:val="0"/>
-          <w:bCs/>
-        </w:rPr>
-        <w:t>vol.bullet</w:t>
-      </w:r>
-      <w:proofErr w:type="gramEnd"/>
-      <w:r>
-        <w:rPr>
-          <w:b w:val="0"/>
-          <w:bCs/>
-        </w:rPr>
-        <w:t>_</w:t>
-      </w:r>
-      <w:proofErr w:type="gramStart"/>
-      <w:r>
-        <w:rPr>
-          <w:b w:val="0"/>
-          <w:bCs/>
-        </w:rPr>
-        <w:t>points</w:t>
+      <w:r>
+        <w:rPr>
+          <w:b w:val="0"/>
+          <w:bCs/>
+        </w:rPr>
+        <w:t>vol.bullet_points</w:t>
       </w:r>
       <w:proofErr w:type="spellEnd"/>
       <w:r>
@@ -1872,7 +1204,6 @@
         </w:rPr>
         <w:t xml:space="preserve"> %}</w:t>
       </w:r>
-      <w:proofErr w:type="gramEnd"/>
     </w:p>
     <w:p>
       <w:pPr>
@@ -1886,23 +1217,7 @@
           <w:b w:val="0"/>
           <w:bCs/>
         </w:rPr>
-        <w:t xml:space="preserve">• </w:t>
-      </w:r>
-      <w:proofErr w:type="gramStart"/>
-      <w:r>
-        <w:rPr>
-          <w:b w:val="0"/>
-          <w:bCs/>
-        </w:rPr>
-        <w:t>{{ bullet</w:t>
-      </w:r>
-      <w:proofErr w:type="gramEnd"/>
-      <w:r>
-        <w:rPr>
-          <w:b w:val="0"/>
-          <w:bCs/>
-        </w:rPr>
-        <w:t xml:space="preserve"> }}</w:t>
+        <w:t>• {{ bullet }}</w:t>
       </w:r>
     </w:p>
     <w:p>
@@ -2039,23 +1354,13 @@
         <w:t xml:space="preserve">{% if </w:t>
       </w:r>
       <w:proofErr w:type="spellStart"/>
-      <w:proofErr w:type="gramStart"/>
       <w:r>
         <w:rPr>
           <w:b w:val="0"/>
           <w:bCs/>
           <w:color w:val="auto"/>
         </w:rPr>
-        <w:t>candidate.technical</w:t>
-      </w:r>
-      <w:proofErr w:type="gramEnd"/>
-      <w:r>
-        <w:rPr>
-          <w:b w:val="0"/>
-          <w:bCs/>
-          <w:color w:val="auto"/>
-        </w:rPr>
-        <w:t>_skills</w:t>
+        <w:t>candidate.technical_skills</w:t>
       </w:r>
       <w:proofErr w:type="spellEnd"/>
       <w:r>
@@ -2083,7 +1388,6 @@
         </w:rPr>
         <w:t xml:space="preserve">Technical Skills: </w:t>
       </w:r>
-      <w:proofErr w:type="gramStart"/>
       <w:r>
         <w:rPr>
           <w:b w:val="0"/>
@@ -2099,61 +1403,16 @@
           <w:bCs/>
           <w:color w:val="auto"/>
         </w:rPr>
-        <w:t>candidate</w:t>
-      </w:r>
-      <w:proofErr w:type="gramEnd"/>
+        <w:t>candidate.technical_skills</w:t>
+      </w:r>
+      <w:proofErr w:type="spellEnd"/>
       <w:r>
         <w:rPr>
           <w:b w:val="0"/>
           <w:bCs/>
           <w:color w:val="auto"/>
         </w:rPr>
-        <w:t>.technical_skills</w:t>
-      </w:r>
-      <w:proofErr w:type="spellEnd"/>
-      <w:r>
-        <w:rPr>
-          <w:b w:val="0"/>
-          <w:bCs/>
-          <w:color w:val="auto"/>
-        </w:rPr>
-        <w:t xml:space="preserve"> | </w:t>
-      </w:r>
-      <w:proofErr w:type="gramStart"/>
-      <w:r>
-        <w:rPr>
-          <w:b w:val="0"/>
-          <w:bCs/>
-          <w:color w:val="auto"/>
-        </w:rPr>
-        <w:t>join(</w:t>
-      </w:r>
-      <w:proofErr w:type="gramEnd"/>
-      <w:r>
-        <w:rPr>
-          <w:b w:val="0"/>
-          <w:bCs/>
-          <w:color w:val="auto"/>
-        </w:rPr>
-        <w:t>" • "</w:t>
-      </w:r>
-      <w:proofErr w:type="gramStart"/>
-      <w:r>
-        <w:rPr>
-          <w:b w:val="0"/>
-          <w:bCs/>
-          <w:color w:val="auto"/>
-        </w:rPr>
-        <w:t>) }</w:t>
-      </w:r>
-      <w:proofErr w:type="gramEnd"/>
-      <w:r>
-        <w:rPr>
-          <w:b w:val="0"/>
-          <w:bCs/>
-          <w:color w:val="auto"/>
-        </w:rPr>
-        <w:t>}</w:t>
+        <w:t xml:space="preserve"> | join(" • ") }}</w:t>
       </w:r>
     </w:p>
     <w:p>
@@ -2173,23 +1432,13 @@
         <w:t xml:space="preserve">{% if </w:t>
       </w:r>
       <w:proofErr w:type="spellStart"/>
-      <w:proofErr w:type="gramStart"/>
       <w:r>
         <w:rPr>
           <w:b w:val="0"/>
           <w:bCs/>
           <w:color w:val="auto"/>
         </w:rPr>
-        <w:t>candidate.soft</w:t>
-      </w:r>
-      <w:proofErr w:type="gramEnd"/>
-      <w:r>
-        <w:rPr>
-          <w:b w:val="0"/>
-          <w:bCs/>
-          <w:color w:val="auto"/>
-        </w:rPr>
-        <w:t>_skills</w:t>
+        <w:t>candidate.soft_skills</w:t>
       </w:r>
       <w:proofErr w:type="spellEnd"/>
       <w:r>
@@ -2217,7 +1466,6 @@
         </w:rPr>
         <w:t xml:space="preserve">Soft Skills: </w:t>
       </w:r>
-      <w:proofErr w:type="gramStart"/>
       <w:r>
         <w:rPr>
           <w:b w:val="0"/>
@@ -2233,16 +1481,15 @@
           <w:bCs/>
           <w:color w:val="auto"/>
         </w:rPr>
-        <w:t>candidate</w:t>
-      </w:r>
-      <w:proofErr w:type="gramEnd"/>
+        <w:t>candidate.</w:t>
+      </w:r>
       <w:r>
         <w:rPr>
           <w:b w:val="0"/>
           <w:bCs/>
           <w:color w:val="auto"/>
         </w:rPr>
-        <w:t>.</w:t>
+        <w:t>soft</w:t>
       </w:r>
       <w:r>
         <w:rPr>
@@ -2250,60 +1497,16 @@
           <w:bCs/>
           <w:color w:val="auto"/>
         </w:rPr>
-        <w:t>soft</w:t>
-      </w:r>
+        <w:t>_skills</w:t>
+      </w:r>
+      <w:proofErr w:type="spellEnd"/>
       <w:r>
         <w:rPr>
           <w:b w:val="0"/>
           <w:bCs/>
           <w:color w:val="auto"/>
         </w:rPr>
-        <w:t>_skills</w:t>
-      </w:r>
-      <w:proofErr w:type="spellEnd"/>
-      <w:r>
-        <w:rPr>
-          <w:b w:val="0"/>
-          <w:bCs/>
-          <w:color w:val="auto"/>
-        </w:rPr>
-        <w:t xml:space="preserve"> | </w:t>
-      </w:r>
-      <w:proofErr w:type="gramStart"/>
-      <w:r>
-        <w:rPr>
-          <w:b w:val="0"/>
-          <w:bCs/>
-          <w:color w:val="auto"/>
-        </w:rPr>
-        <w:t>join(</w:t>
-      </w:r>
-      <w:proofErr w:type="gramEnd"/>
-      <w:r>
-        <w:rPr>
-          <w:b w:val="0"/>
-          <w:bCs/>
-          <w:color w:val="auto"/>
-        </w:rPr>
-        <w:t>" • "</w:t>
-      </w:r>
-      <w:proofErr w:type="gramStart"/>
-      <w:r>
-        <w:rPr>
-          <w:b w:val="0"/>
-          <w:bCs/>
-          <w:color w:val="auto"/>
-        </w:rPr>
-        <w:t>) }</w:t>
-      </w:r>
-      <w:proofErr w:type="gramEnd"/>
-      <w:r>
-        <w:rPr>
-          <w:b w:val="0"/>
-          <w:bCs/>
-          <w:color w:val="auto"/>
-        </w:rPr>
-        <w:t>}</w:t>
+        <w:t xml:space="preserve"> | join(" • ") }}</w:t>
       </w:r>
     </w:p>
     <w:p>
@@ -2323,23 +1526,31 @@
         <w:t xml:space="preserve">{% if not </w:t>
       </w:r>
       <w:proofErr w:type="spellStart"/>
-      <w:proofErr w:type="gramStart"/>
       <w:r>
         <w:rPr>
           <w:b w:val="0"/>
           <w:bCs/>
           <w:color w:val="auto"/>
         </w:rPr>
-        <w:t>candidate.technical</w:t>
-      </w:r>
-      <w:proofErr w:type="gramEnd"/>
+        <w:t>candidate.technical_skills</w:t>
+      </w:r>
+      <w:proofErr w:type="spellEnd"/>
       <w:r>
         <w:rPr>
           <w:b w:val="0"/>
           <w:bCs/>
           <w:color w:val="auto"/>
         </w:rPr>
-        <w:t>_skills</w:t>
+        <w:t xml:space="preserve"> and not </w:t>
+      </w:r>
+      <w:proofErr w:type="spellStart"/>
+      <w:r>
+        <w:rPr>
+          <w:b w:val="0"/>
+          <w:bCs/>
+          <w:color w:val="auto"/>
+        </w:rPr>
+        <w:t>candidate.soft_skills</w:t>
       </w:r>
       <w:proofErr w:type="spellEnd"/>
       <w:r>
@@ -2348,54 +1559,16 @@
           <w:bCs/>
           <w:color w:val="auto"/>
         </w:rPr>
-        <w:t xml:space="preserve"> and not </w:t>
+        <w:t xml:space="preserve"> and </w:t>
       </w:r>
       <w:proofErr w:type="spellStart"/>
-      <w:proofErr w:type="gramStart"/>
       <w:r>
         <w:rPr>
           <w:b w:val="0"/>
           <w:bCs/>
           <w:color w:val="auto"/>
         </w:rPr>
-        <w:t>candidate.soft</w:t>
-      </w:r>
-      <w:proofErr w:type="gramEnd"/>
-      <w:r>
-        <w:rPr>
-          <w:b w:val="0"/>
-          <w:bCs/>
-          <w:color w:val="auto"/>
-        </w:rPr>
-        <w:t>_skills</w:t>
-      </w:r>
-      <w:proofErr w:type="spellEnd"/>
-      <w:r>
-        <w:rPr>
-          <w:b w:val="0"/>
-          <w:bCs/>
-          <w:color w:val="auto"/>
-        </w:rPr>
-        <w:t xml:space="preserve"> and </w:t>
-      </w:r>
-      <w:proofErr w:type="spellStart"/>
-      <w:proofErr w:type="gramStart"/>
-      <w:r>
-        <w:rPr>
-          <w:b w:val="0"/>
-          <w:bCs/>
-          <w:color w:val="auto"/>
-        </w:rPr>
-        <w:t>candidate.skills</w:t>
-      </w:r>
-      <w:proofErr w:type="gramEnd"/>
-      <w:r>
-        <w:rPr>
-          <w:b w:val="0"/>
-          <w:bCs/>
-          <w:color w:val="auto"/>
-        </w:rPr>
-        <w:t>_flat</w:t>
+        <w:t>candidate.skills_flat</w:t>
       </w:r>
       <w:proofErr w:type="spellEnd"/>
       <w:r>
@@ -2414,7 +1587,6 @@
           <w:rStyle w:val="NotBold"/>
         </w:rPr>
       </w:pPr>
-      <w:proofErr w:type="gramStart"/>
       <w:r>
         <w:rPr>
           <w:rStyle w:val="NotBold"/>
@@ -2426,67 +1598,74 @@
         <w:rPr>
           <w:rStyle w:val="NotBold"/>
         </w:rPr>
-        <w:t>candidate</w:t>
-      </w:r>
-      <w:proofErr w:type="gramEnd"/>
+        <w:t>candidate.skills</w:t>
+      </w:r>
       <w:r>
         <w:rPr>
           <w:rStyle w:val="NotBold"/>
         </w:rPr>
-        <w:t>.skills</w:t>
-      </w:r>
+        <w:t>_flat</w:t>
+      </w:r>
+      <w:proofErr w:type="spellEnd"/>
       <w:r>
         <w:rPr>
           <w:rStyle w:val="NotBold"/>
         </w:rPr>
-        <w:t>_flat</w:t>
-      </w:r>
-      <w:proofErr w:type="spellEnd"/>
+        <w:t xml:space="preserve"> | join(" •</w:t>
+      </w:r>
       <w:r>
         <w:rPr>
           <w:rStyle w:val="NotBold"/>
         </w:rPr>
-        <w:t xml:space="preserve"> | </w:t>
-      </w:r>
-      <w:proofErr w:type="gramStart"/>
+        <w:t xml:space="preserve"> </w:t>
+      </w:r>
       <w:r>
         <w:rPr>
           <w:rStyle w:val="NotBold"/>
         </w:rPr>
-        <w:t>join(</w:t>
-      </w:r>
-      <w:proofErr w:type="gramEnd"/>
-      <w:r>
+        <w:t xml:space="preserve"> ") }}</w:t>
+      </w:r>
+    </w:p>
+    <w:p>
+      <w:pPr>
+        <w:spacing w:after="80" w:line="240" w:lineRule="auto"/>
         <w:rPr>
           <w:rStyle w:val="NotBold"/>
         </w:rPr>
-        <w:t xml:space="preserve">" </w:t>
-      </w:r>
-      <w:proofErr w:type="gramStart"/>
+      </w:pPr>
       <w:r>
         <w:rPr>
           <w:rStyle w:val="NotBold"/>
         </w:rPr>
-        <w:t>•</w:t>
-      </w:r>
-      <w:r>
+        <w:t>{% endif %}</w:t>
+      </w:r>
+    </w:p>
+    <w:p>
+      <w:pPr>
+        <w:spacing w:after="80" w:line="240" w:lineRule="auto"/>
         <w:rPr>
           <w:rStyle w:val="NotBold"/>
         </w:rPr>
-        <w:t xml:space="preserve"> </w:t>
-      </w:r>
+      </w:pPr>
       <w:r>
         <w:rPr>
           <w:rStyle w:val="NotBold"/>
         </w:rPr>
-        <w:t xml:space="preserve"> ") }</w:t>
-      </w:r>
-      <w:proofErr w:type="gramEnd"/>
-      <w:r>
+        <w:t>{% endif %}</w:t>
+      </w:r>
+    </w:p>
+    <w:p>
+      <w:pPr>
+        <w:spacing w:after="80" w:line="240" w:lineRule="auto"/>
         <w:rPr>
           <w:rStyle w:val="NotBold"/>
         </w:rPr>
-        <w:t>}</w:t>
+      </w:pPr>
+      <w:r>
+        <w:rPr>
+          <w:rStyle w:val="NotBold"/>
+        </w:rPr>
+        <w:t xml:space="preserve">{% endif %} </w:t>
       </w:r>
     </w:p>
     <w:sectPr>
@@ -5658,6 +4837,7 @@
     <w:rsidRoot w:val="00546C4D"/>
     <w:rsid w:val="000B571F"/>
     <w:rsid w:val="000C4CF5"/>
+    <w:rsid w:val="001158BB"/>
     <w:rsid w:val="00132BCB"/>
     <w:rsid w:val="002C4A40"/>
     <w:rsid w:val="002F7A05"/>
@@ -5665,6 +4845,7 @@
     <w:rsid w:val="00546C4D"/>
     <w:rsid w:val="006B3502"/>
     <w:rsid w:val="00727DBA"/>
+    <w:rsid w:val="007E0FE7"/>
     <w:rsid w:val="00E33F22"/>
   </w:rsids>
   <m:mathPr>
@@ -6456,35 +5637,6 @@
 </file>
 
 <file path=customXml/item1.xml><?xml version="1.0" encoding="utf-8"?>
-<?mso-contentType ?>
-<FormTemplates xmlns="http://schemas.microsoft.com/sharepoint/v3/contenttype/forms">
-  <Display>DocumentLibraryForm</Display>
-  <Edit>DocumentLibraryForm</Edit>
-  <New>DocumentLibraryForm</New>
-</FormTemplates>
-</file>
-
-<file path=customXml/item2.xml><?xml version="1.0" encoding="utf-8"?>
-<p:properties xmlns:p="http://schemas.microsoft.com/office/2006/metadata/properties" xmlns:xsi="http://www.w3.org/2001/XMLSchema-instance" xmlns:pc="http://schemas.microsoft.com/office/infopath/2007/PartnerControls">
-  <documentManagement>
-    <_ip_UnifiedCompliancePolicyUIAction xmlns="http://schemas.microsoft.com/sharepoint/v3" xsi:nil="true"/>
-    <Image xmlns="71af3243-3dd4-4a8d-8c0d-dd76da1f02a5">
-      <Url xsi:nil="true"/>
-      <Description xsi:nil="true"/>
-    </Image>
-    <Status xmlns="71af3243-3dd4-4a8d-8c0d-dd76da1f02a5">Not started</Status>
-    <Background xmlns="71af3243-3dd4-4a8d-8c0d-dd76da1f02a5">false</Background>
-    <_ip_UnifiedCompliancePolicyProperties xmlns="http://schemas.microsoft.com/sharepoint/v3" xsi:nil="true"/>
-    <ImageTagsTaxHTField xmlns="71af3243-3dd4-4a8d-8c0d-dd76da1f02a5">
-      <Terms xmlns="http://schemas.microsoft.com/office/infopath/2007/PartnerControls"/>
-    </ImageTagsTaxHTField>
-    <TaxCatchAll xmlns="230e9df3-be65-4c73-a93b-d1236ebd677e" xsi:nil="true"/>
-    <MediaServiceKeyPoints xmlns="71af3243-3dd4-4a8d-8c0d-dd76da1f02a5" xsi:nil="true"/>
-  </documentManagement>
-</p:properties>
-</file>
-
-<file path=customXml/item3.xml><?xml version="1.0" encoding="utf-8"?>
 <ct:contentTypeSchema xmlns:ct="http://schemas.microsoft.com/office/2006/metadata/contentType" xmlns:ma="http://schemas.microsoft.com/office/2006/metadata/properties/metaAttributes" ct:_="" ma:_="" ma:contentTypeName="Document" ma:contentTypeID="0x01010079F111ED35F8CC479449609E8A0923A6" ma:contentTypeVersion="28" ma:contentTypeDescription="Create a new document." ma:contentTypeScope="" ma:versionID="60f5a4f2d2b0abadcf532d48ebf9cb71">
   <xsd:schema xmlns:xsd="http://www.w3.org/2001/XMLSchema" xmlns:xs="http://www.w3.org/2001/XMLSchema" xmlns:p="http://schemas.microsoft.com/office/2006/metadata/properties" xmlns:ns1="http://schemas.microsoft.com/sharepoint/v3" xmlns:ns2="71af3243-3dd4-4a8d-8c0d-dd76da1f02a5" xmlns:ns3="16c05727-aa75-4e4a-9b5f-8a80a1165891" xmlns:ns4="230e9df3-be65-4c73-a93b-d1236ebd677e" targetNamespace="http://schemas.microsoft.com/office/2006/metadata/properties" ma:root="true" ma:fieldsID="7dd78129e6a1811f84807ad11c651531" ns1:_="" ns2:_="" ns3:_="" ns4:_="">
     <xsd:import namespace="http://schemas.microsoft.com/sharepoint/v3"/>
@@ -6796,27 +5948,36 @@
 </ct:contentTypeSchema>
 </file>
 
-<file path=customXml/itemProps1.xml><?xml version="1.0" encoding="utf-8"?>
-<ds:datastoreItem xmlns:ds="http://schemas.openxmlformats.org/officeDocument/2006/customXml" ds:itemID="{B68BEF44-5CE4-407D-801F-ABCD28C15FEF}">
-  <ds:schemaRefs>
-    <ds:schemaRef ds:uri="http://schemas.microsoft.com/sharepoint/v3/contenttype/forms"/>
-  </ds:schemaRefs>
-</ds:datastoreItem>
+<file path=customXml/item2.xml><?xml version="1.0" encoding="utf-8"?>
+<p:properties xmlns:p="http://schemas.microsoft.com/office/2006/metadata/properties" xmlns:xsi="http://www.w3.org/2001/XMLSchema-instance" xmlns:pc="http://schemas.microsoft.com/office/infopath/2007/PartnerControls">
+  <documentManagement>
+    <_ip_UnifiedCompliancePolicyUIAction xmlns="http://schemas.microsoft.com/sharepoint/v3" xsi:nil="true"/>
+    <Image xmlns="71af3243-3dd4-4a8d-8c0d-dd76da1f02a5">
+      <Url xsi:nil="true"/>
+      <Description xsi:nil="true"/>
+    </Image>
+    <Status xmlns="71af3243-3dd4-4a8d-8c0d-dd76da1f02a5">Not started</Status>
+    <Background xmlns="71af3243-3dd4-4a8d-8c0d-dd76da1f02a5">false</Background>
+    <_ip_UnifiedCompliancePolicyProperties xmlns="http://schemas.microsoft.com/sharepoint/v3" xsi:nil="true"/>
+    <ImageTagsTaxHTField xmlns="71af3243-3dd4-4a8d-8c0d-dd76da1f02a5">
+      <Terms xmlns="http://schemas.microsoft.com/office/infopath/2007/PartnerControls"/>
+    </ImageTagsTaxHTField>
+    <TaxCatchAll xmlns="230e9df3-be65-4c73-a93b-d1236ebd677e" xsi:nil="true"/>
+    <MediaServiceKeyPoints xmlns="71af3243-3dd4-4a8d-8c0d-dd76da1f02a5" xsi:nil="true"/>
+  </documentManagement>
+</p:properties>
 </file>
 
-<file path=customXml/itemProps2.xml><?xml version="1.0" encoding="utf-8"?>
-<ds:datastoreItem xmlns:ds="http://schemas.openxmlformats.org/officeDocument/2006/customXml" ds:itemID="{9C488EFA-900E-4405-BD4E-E83D13AD8CB6}">
-  <ds:schemaRefs>
-    <ds:schemaRef ds:uri="http://schemas.microsoft.com/office/2006/metadata/properties"/>
-    <ds:schemaRef ds:uri="http://schemas.microsoft.com/office/infopath/2007/PartnerControls"/>
-    <ds:schemaRef ds:uri="http://schemas.microsoft.com/sharepoint/v3"/>
-    <ds:schemaRef ds:uri="71af3243-3dd4-4a8d-8c0d-dd76da1f02a5"/>
-    <ds:schemaRef ds:uri="230e9df3-be65-4c73-a93b-d1236ebd677e"/>
-  </ds:schemaRefs>
-</ds:datastoreItem>
+<file path=customXml/item3.xml><?xml version="1.0" encoding="utf-8"?>
+<?mso-contentType ?>
+<FormTemplates xmlns="http://schemas.microsoft.com/sharepoint/v3/contenttype/forms">
+  <Display>DocumentLibraryForm</Display>
+  <Edit>DocumentLibraryForm</Edit>
+  <New>DocumentLibraryForm</New>
+</FormTemplates>
 </file>
 
-<file path=customXml/itemProps3.xml><?xml version="1.0" encoding="utf-8"?>
+<file path=customXml/itemProps1.xml><?xml version="1.0" encoding="utf-8"?>
 <ds:datastoreItem xmlns:ds="http://schemas.openxmlformats.org/officeDocument/2006/customXml" ds:itemID="{F1773DEF-F3EB-4EBC-916F-5D6A2722CF6F}">
   <ds:schemaRefs>
     <ds:schemaRef ds:uri="http://schemas.microsoft.com/office/2006/metadata/contentType"/>
@@ -6837,6 +5998,26 @@
 </ds:datastoreItem>
 </file>
 
+<file path=customXml/itemProps2.xml><?xml version="1.0" encoding="utf-8"?>
+<ds:datastoreItem xmlns:ds="http://schemas.openxmlformats.org/officeDocument/2006/customXml" ds:itemID="{9C488EFA-900E-4405-BD4E-E83D13AD8CB6}">
+  <ds:schemaRefs>
+    <ds:schemaRef ds:uri="http://schemas.microsoft.com/office/2006/metadata/properties"/>
+    <ds:schemaRef ds:uri="http://schemas.microsoft.com/office/infopath/2007/PartnerControls"/>
+    <ds:schemaRef ds:uri="http://schemas.microsoft.com/sharepoint/v3"/>
+    <ds:schemaRef ds:uri="71af3243-3dd4-4a8d-8c0d-dd76da1f02a5"/>
+    <ds:schemaRef ds:uri="230e9df3-be65-4c73-a93b-d1236ebd677e"/>
+  </ds:schemaRefs>
+</ds:datastoreItem>
+</file>
+
+<file path=customXml/itemProps3.xml><?xml version="1.0" encoding="utf-8"?>
+<ds:datastoreItem xmlns:ds="http://schemas.openxmlformats.org/officeDocument/2006/customXml" ds:itemID="{B68BEF44-5CE4-407D-801F-ABCD28C15FEF}">
+  <ds:schemaRefs>
+    <ds:schemaRef ds:uri="http://schemas.microsoft.com/sharepoint/v3/contenttype/forms"/>
+  </ds:schemaRefs>
+</ds:datastoreItem>
+</file>
+
 <file path=docMetadata/LabelInfo.xml><?xml version="1.0" encoding="utf-8"?>
 <clbl:labelList xmlns:clbl="http://schemas.microsoft.com/office/2020/mipLabelMetadata"/>
 </file>
</xml_diff>

<commit_message>
more resume template changes
</commit_message>
<xml_diff>
--- a/template/templateResumeDocV2.docx
+++ b/template/templateResumeDocV2.docx
@@ -1339,245 +1339,122 @@
     </w:tbl>
     <w:p>
       <w:pPr>
-        <w:rPr>
-          <w:b w:val="0"/>
-          <w:bCs/>
-          <w:color w:val="auto"/>
-        </w:rPr>
-      </w:pPr>
-      <w:r>
-        <w:rPr>
-          <w:b w:val="0"/>
-          <w:bCs/>
-          <w:color w:val="auto"/>
+        <w:spacing w:after="80" w:line="240" w:lineRule="auto"/>
+        <w:rPr>
+          <w:rStyle w:val="NotBold"/>
+        </w:rPr>
+      </w:pPr>
+      <w:r>
+        <w:rPr>
+          <w:rStyle w:val="NotBold"/>
         </w:rPr>
         <w:t xml:space="preserve">{% if </w:t>
       </w:r>
       <w:proofErr w:type="spellStart"/>
       <w:r>
         <w:rPr>
-          <w:b w:val="0"/>
-          <w:bCs/>
-          <w:color w:val="auto"/>
+          <w:rStyle w:val="NotBold"/>
         </w:rPr>
         <w:t>candidate.technical_skills</w:t>
       </w:r>
       <w:proofErr w:type="spellEnd"/>
       <w:r>
         <w:rPr>
-          <w:b w:val="0"/>
-          <w:bCs/>
-          <w:color w:val="auto"/>
+          <w:rStyle w:val="NotBold"/>
         </w:rPr>
         <w:t xml:space="preserve"> %}</w:t>
       </w:r>
     </w:p>
     <w:p>
       <w:pPr>
-        <w:rPr>
-          <w:b w:val="0"/>
-          <w:bCs/>
-          <w:color w:val="auto"/>
-        </w:rPr>
-      </w:pPr>
-      <w:r>
-        <w:rPr>
-          <w:b w:val="0"/>
-          <w:bCs/>
-          <w:color w:val="auto"/>
-        </w:rPr>
-        <w:t xml:space="preserve">Technical Skills: </w:t>
-      </w:r>
-      <w:r>
-        <w:rPr>
-          <w:b w:val="0"/>
-          <w:bCs/>
-          <w:color w:val="auto"/>
-        </w:rPr>
-        <w:t xml:space="preserve">{{ </w:t>
+        <w:spacing w:after="80" w:line="240" w:lineRule="auto"/>
+        <w:rPr>
+          <w:rStyle w:val="NotBold"/>
+        </w:rPr>
+      </w:pPr>
+      <w:r>
+        <w:rPr>
+          <w:rStyle w:val="NotBold"/>
+        </w:rPr>
+        <w:t xml:space="preserve">Technical Skills: {{ </w:t>
       </w:r>
       <w:proofErr w:type="spellStart"/>
       <w:r>
         <w:rPr>
-          <w:b w:val="0"/>
-          <w:bCs/>
-          <w:color w:val="auto"/>
+          <w:rStyle w:val="NotBold"/>
         </w:rPr>
         <w:t>candidate.technical_skills</w:t>
       </w:r>
       <w:proofErr w:type="spellEnd"/>
       <w:r>
         <w:rPr>
-          <w:b w:val="0"/>
-          <w:bCs/>
-          <w:color w:val="auto"/>
+          <w:rStyle w:val="NotBold"/>
         </w:rPr>
         <w:t xml:space="preserve"> | join(" • ") }}</w:t>
       </w:r>
     </w:p>
     <w:p>
       <w:pPr>
-        <w:rPr>
-          <w:b w:val="0"/>
-          <w:bCs/>
-          <w:color w:val="auto"/>
-        </w:rPr>
-      </w:pPr>
-      <w:r>
-        <w:rPr>
-          <w:b w:val="0"/>
-          <w:bCs/>
-          <w:color w:val="auto"/>
-        </w:rPr>
-        <w:t xml:space="preserve">{% if </w:t>
-      </w:r>
-      <w:proofErr w:type="spellStart"/>
-      <w:r>
-        <w:rPr>
-          <w:b w:val="0"/>
-          <w:bCs/>
-          <w:color w:val="auto"/>
-        </w:rPr>
-        <w:t>candidate.soft_skills</w:t>
-      </w:r>
-      <w:proofErr w:type="spellEnd"/>
-      <w:r>
-        <w:rPr>
-          <w:b w:val="0"/>
-          <w:bCs/>
-          <w:color w:val="auto"/>
-        </w:rPr>
-        <w:t xml:space="preserve"> %}</w:t>
-      </w:r>
+        <w:spacing w:after="80" w:line="240" w:lineRule="auto"/>
+        <w:rPr>
+          <w:rStyle w:val="NotBold"/>
+        </w:rPr>
+      </w:pPr>
     </w:p>
     <w:p>
       <w:pPr>
-        <w:rPr>
-          <w:b w:val="0"/>
-          <w:bCs/>
-          <w:color w:val="auto"/>
-        </w:rPr>
-      </w:pPr>
-      <w:r>
-        <w:rPr>
-          <w:b w:val="0"/>
-          <w:bCs/>
-          <w:color w:val="auto"/>
-        </w:rPr>
-        <w:t xml:space="preserve">Soft Skills: </w:t>
-      </w:r>
-      <w:r>
-        <w:rPr>
-          <w:b w:val="0"/>
-          <w:bCs/>
-          <w:color w:val="auto"/>
-        </w:rPr>
-        <w:t xml:space="preserve">{{ </w:t>
+        <w:spacing w:after="80" w:line="240" w:lineRule="auto"/>
+        <w:rPr>
+          <w:rStyle w:val="NotBold"/>
+        </w:rPr>
+      </w:pPr>
+      <w:r>
+        <w:rPr>
+          <w:rStyle w:val="NotBold"/>
+        </w:rPr>
+        <w:t xml:space="preserve">{% if </w:t>
       </w:r>
       <w:proofErr w:type="spellStart"/>
       <w:r>
         <w:rPr>
-          <w:b w:val="0"/>
-          <w:bCs/>
-          <w:color w:val="auto"/>
-        </w:rPr>
-        <w:t>candidate.</w:t>
-      </w:r>
-      <w:r>
-        <w:rPr>
-          <w:b w:val="0"/>
-          <w:bCs/>
-          <w:color w:val="auto"/>
-        </w:rPr>
-        <w:t>soft</w:t>
-      </w:r>
-      <w:r>
-        <w:rPr>
-          <w:b w:val="0"/>
-          <w:bCs/>
-          <w:color w:val="auto"/>
-        </w:rPr>
-        <w:t>_skills</w:t>
+          <w:rStyle w:val="NotBold"/>
+        </w:rPr>
+        <w:t>candidate.soft_skills</w:t>
       </w:r>
       <w:proofErr w:type="spellEnd"/>
       <w:r>
         <w:rPr>
-          <w:b w:val="0"/>
-          <w:bCs/>
-          <w:color w:val="auto"/>
-        </w:rPr>
-        <w:t xml:space="preserve"> | join(" • ") }}</w:t>
+          <w:rStyle w:val="NotBold"/>
+        </w:rPr>
+        <w:t xml:space="preserve"> %}</w:t>
       </w:r>
     </w:p>
     <w:p>
       <w:pPr>
-        <w:rPr>
-          <w:b w:val="0"/>
-          <w:bCs/>
-          <w:color w:val="auto"/>
-        </w:rPr>
-      </w:pPr>
-      <w:r>
-        <w:rPr>
-          <w:b w:val="0"/>
-          <w:bCs/>
-          <w:color w:val="auto"/>
-        </w:rPr>
-        <w:t xml:space="preserve">{% if not </w:t>
+        <w:spacing w:after="80" w:line="240" w:lineRule="auto"/>
+        <w:rPr>
+          <w:rStyle w:val="NotBold"/>
+        </w:rPr>
+      </w:pPr>
+      <w:r>
+        <w:rPr>
+          <w:rStyle w:val="NotBold"/>
+        </w:rPr>
+        <w:t xml:space="preserve">Soft Skills: {{ </w:t>
       </w:r>
       <w:proofErr w:type="spellStart"/>
       <w:r>
         <w:rPr>
-          <w:b w:val="0"/>
-          <w:bCs/>
-          <w:color w:val="auto"/>
-        </w:rPr>
-        <w:t>candidate.technical_skills</w:t>
+          <w:rStyle w:val="NotBold"/>
+        </w:rPr>
+        <w:t>candidate.soft_skills</w:t>
       </w:r>
       <w:proofErr w:type="spellEnd"/>
       <w:r>
         <w:rPr>
-          <w:b w:val="0"/>
-          <w:bCs/>
-          <w:color w:val="auto"/>
-        </w:rPr>
-        <w:t xml:space="preserve"> and not </w:t>
-      </w:r>
-      <w:proofErr w:type="spellStart"/>
-      <w:r>
-        <w:rPr>
-          <w:b w:val="0"/>
-          <w:bCs/>
-          <w:color w:val="auto"/>
-        </w:rPr>
-        <w:t>candidate.soft_skills</w:t>
-      </w:r>
-      <w:proofErr w:type="spellEnd"/>
-      <w:r>
-        <w:rPr>
-          <w:b w:val="0"/>
-          <w:bCs/>
-          <w:color w:val="auto"/>
-        </w:rPr>
-        <w:t xml:space="preserve"> and </w:t>
-      </w:r>
-      <w:proofErr w:type="spellStart"/>
-      <w:r>
-        <w:rPr>
-          <w:b w:val="0"/>
-          <w:bCs/>
-          <w:color w:val="auto"/>
-        </w:rPr>
-        <w:t>candidate.skills_flat</w:t>
-      </w:r>
-      <w:proofErr w:type="spellEnd"/>
-      <w:r>
-        <w:rPr>
-          <w:b w:val="0"/>
-          <w:bCs/>
-          <w:color w:val="auto"/>
-        </w:rPr>
-        <w:t xml:space="preserve"> %}</w:t>
+          <w:rStyle w:val="NotBold"/>
+        </w:rPr>
+        <w:t xml:space="preserve"> | join(" • ") }}</w:t>
       </w:r>
     </w:p>
     <w:p>
@@ -1587,44 +1464,6 @@
           <w:rStyle w:val="NotBold"/>
         </w:rPr>
       </w:pPr>
-      <w:r>
-        <w:rPr>
-          <w:rStyle w:val="NotBold"/>
-        </w:rPr>
-        <w:t xml:space="preserve">{{ </w:t>
-      </w:r>
-      <w:proofErr w:type="spellStart"/>
-      <w:r>
-        <w:rPr>
-          <w:rStyle w:val="NotBold"/>
-        </w:rPr>
-        <w:t>candidate.skills</w:t>
-      </w:r>
-      <w:r>
-        <w:rPr>
-          <w:rStyle w:val="NotBold"/>
-        </w:rPr>
-        <w:t>_flat</w:t>
-      </w:r>
-      <w:proofErr w:type="spellEnd"/>
-      <w:r>
-        <w:rPr>
-          <w:rStyle w:val="NotBold"/>
-        </w:rPr>
-        <w:t xml:space="preserve"> | join(" •</w:t>
-      </w:r>
-      <w:r>
-        <w:rPr>
-          <w:rStyle w:val="NotBold"/>
-        </w:rPr>
-        <w:t xml:space="preserve"> </w:t>
-      </w:r>
-      <w:r>
-        <w:rPr>
-          <w:rStyle w:val="NotBold"/>
-        </w:rPr>
-        <w:t xml:space="preserve"> ") }}</w:t>
-      </w:r>
     </w:p>
     <w:p>
       <w:pPr>
@@ -1637,7 +1476,49 @@
         <w:rPr>
           <w:rStyle w:val="NotBold"/>
         </w:rPr>
-        <w:t>{% endif %}</w:t>
+        <w:t xml:space="preserve">{% if not </w:t>
+      </w:r>
+      <w:proofErr w:type="spellStart"/>
+      <w:r>
+        <w:rPr>
+          <w:rStyle w:val="NotBold"/>
+        </w:rPr>
+        <w:t>candidate.technical_skills</w:t>
+      </w:r>
+      <w:proofErr w:type="spellEnd"/>
+      <w:r>
+        <w:rPr>
+          <w:rStyle w:val="NotBold"/>
+        </w:rPr>
+        <w:t xml:space="preserve"> and not </w:t>
+      </w:r>
+      <w:proofErr w:type="spellStart"/>
+      <w:r>
+        <w:rPr>
+          <w:rStyle w:val="NotBold"/>
+        </w:rPr>
+        <w:t>candidate.soft_skills</w:t>
+      </w:r>
+      <w:proofErr w:type="spellEnd"/>
+      <w:r>
+        <w:rPr>
+          <w:rStyle w:val="NotBold"/>
+        </w:rPr>
+        <w:t xml:space="preserve"> and </w:t>
+      </w:r>
+      <w:proofErr w:type="spellStart"/>
+      <w:r>
+        <w:rPr>
+          <w:rStyle w:val="NotBold"/>
+        </w:rPr>
+        <w:t>candidate.skills_flat</w:t>
+      </w:r>
+      <w:proofErr w:type="spellEnd"/>
+      <w:r>
+        <w:rPr>
+          <w:rStyle w:val="NotBold"/>
+        </w:rPr>
+        <w:t xml:space="preserve"> %}</w:t>
       </w:r>
     </w:p>
     <w:p>
@@ -1651,7 +1532,21 @@
         <w:rPr>
           <w:rStyle w:val="NotBold"/>
         </w:rPr>
-        <w:t>{% endif %}</w:t>
+        <w:t xml:space="preserve">{{ </w:t>
+      </w:r>
+      <w:proofErr w:type="spellStart"/>
+      <w:r>
+        <w:rPr>
+          <w:rStyle w:val="NotBold"/>
+        </w:rPr>
+        <w:t>candidate.skills_flat</w:t>
+      </w:r>
+      <w:proofErr w:type="spellEnd"/>
+      <w:r>
+        <w:rPr>
+          <w:rStyle w:val="NotBold"/>
+        </w:rPr>
+        <w:t xml:space="preserve"> | join(" •  ") }}</w:t>
       </w:r>
     </w:p>
     <w:p>
@@ -1665,7 +1560,35 @@
         <w:rPr>
           <w:rStyle w:val="NotBold"/>
         </w:rPr>
-        <w:t xml:space="preserve">{% endif %} </w:t>
+        <w:t>{% endif %}</w:t>
+      </w:r>
+    </w:p>
+    <w:p>
+      <w:pPr>
+        <w:spacing w:after="80" w:line="240" w:lineRule="auto"/>
+        <w:rPr>
+          <w:rStyle w:val="NotBold"/>
+        </w:rPr>
+      </w:pPr>
+      <w:r>
+        <w:rPr>
+          <w:rStyle w:val="NotBold"/>
+        </w:rPr>
+        <w:t>{% endif %}</w:t>
+      </w:r>
+    </w:p>
+    <w:p>
+      <w:pPr>
+        <w:spacing w:after="80" w:line="240" w:lineRule="auto"/>
+        <w:rPr>
+          <w:rStyle w:val="NotBold"/>
+        </w:rPr>
+      </w:pPr>
+      <w:r>
+        <w:rPr>
+          <w:rStyle w:val="NotBold"/>
+        </w:rPr>
+        <w:t>{% endif %}</w:t>
       </w:r>
     </w:p>
     <w:sectPr>
@@ -4845,7 +4768,7 @@
     <w:rsid w:val="00546C4D"/>
     <w:rsid w:val="006B3502"/>
     <w:rsid w:val="00727DBA"/>
-    <w:rsid w:val="007E0FE7"/>
+    <w:rsid w:val="007363E4"/>
     <w:rsid w:val="00E33F22"/>
   </w:rsids>
   <m:mathPr>

</xml_diff>